<commit_message>
Installation object export added
</commit_message>
<xml_diff>
--- a/md/ACHIVEMENTS-BUSINESS_RULES/Achievement_Business_Rules.docx
+++ b/md/ACHIVEMENTS-BUSINESS_RULES/Achievement_Business_Rules.docx
@@ -236,6 +236,7 @@
             <w:pPr>
               <w:pStyle w:val="Normal"/>
               <w:widowControl/>
+              <w:suppressAutoHyphens w:val="true"/>
               <w:spacing w:lineRule="auto" w:line="240" w:before="0" w:after="0"/>
               <w:jc w:val="left"/>
               <w:rPr>
@@ -268,6 +269,7 @@
             <w:pPr>
               <w:pStyle w:val="Normal"/>
               <w:widowControl/>
+              <w:suppressAutoHyphens w:val="true"/>
               <w:spacing w:lineRule="auto" w:line="240" w:before="0" w:after="0"/>
               <w:jc w:val="left"/>
               <w:rPr>
@@ -304,6 +306,7 @@
             <w:pPr>
               <w:pStyle w:val="Normal"/>
               <w:widowControl/>
+              <w:suppressAutoHyphens w:val="true"/>
               <w:spacing w:lineRule="auto" w:line="240" w:before="0" w:after="0"/>
               <w:jc w:val="left"/>
               <w:rPr>
@@ -336,6 +339,7 @@
             <w:pPr>
               <w:pStyle w:val="Normal"/>
               <w:widowControl/>
+              <w:suppressAutoHyphens w:val="true"/>
               <w:spacing w:lineRule="auto" w:line="240" w:before="0" w:after="0"/>
               <w:jc w:val="left"/>
               <w:rPr>
@@ -371,6 +375,7 @@
             <w:pPr>
               <w:pStyle w:val="Normal"/>
               <w:widowControl/>
+              <w:suppressAutoHyphens w:val="true"/>
               <w:spacing w:lineRule="auto" w:line="240" w:before="0" w:after="0"/>
               <w:jc w:val="left"/>
               <w:rPr>
@@ -403,6 +408,7 @@
             <w:pPr>
               <w:pStyle w:val="Normal"/>
               <w:widowControl/>
+              <w:suppressAutoHyphens w:val="true"/>
               <w:spacing w:lineRule="auto" w:line="240" w:before="0" w:after="0"/>
               <w:jc w:val="left"/>
               <w:rPr>
@@ -438,6 +444,7 @@
             <w:pPr>
               <w:pStyle w:val="Normal"/>
               <w:widowControl/>
+              <w:suppressAutoHyphens w:val="true"/>
               <w:spacing w:lineRule="auto" w:line="240" w:before="0" w:after="0"/>
               <w:jc w:val="left"/>
               <w:rPr>
@@ -470,6 +477,7 @@
             <w:pPr>
               <w:pStyle w:val="Normal"/>
               <w:widowControl/>
+              <w:suppressAutoHyphens w:val="true"/>
               <w:spacing w:lineRule="auto" w:line="240" w:before="0" w:after="0"/>
               <w:jc w:val="left"/>
               <w:rPr>
@@ -505,6 +513,7 @@
             <w:pPr>
               <w:pStyle w:val="Normal"/>
               <w:widowControl/>
+              <w:suppressAutoHyphens w:val="true"/>
               <w:spacing w:lineRule="auto" w:line="240" w:before="0" w:after="0"/>
               <w:jc w:val="left"/>
               <w:rPr>
@@ -537,6 +546,7 @@
             <w:pPr>
               <w:pStyle w:val="Normal"/>
               <w:widowControl/>
+              <w:suppressAutoHyphens w:val="true"/>
               <w:spacing w:lineRule="auto" w:line="240" w:before="0" w:after="0"/>
               <w:jc w:val="left"/>
               <w:rPr>
@@ -636,7 +646,7 @@
         <w:gridCol w:w="1473"/>
         <w:gridCol w:w="1705"/>
         <w:gridCol w:w="4983"/>
-        <w:gridCol w:w="893"/>
+        <w:gridCol w:w="892"/>
       </w:tblGrid>
       <w:tr>
         <w:trPr/>
@@ -649,6 +659,7 @@
             <w:pPr>
               <w:pStyle w:val="Normal"/>
               <w:widowControl/>
+              <w:suppressAutoHyphens w:val="true"/>
               <w:spacing w:lineRule="auto" w:line="240" w:before="0" w:after="0"/>
               <w:jc w:val="center"/>
               <w:rPr>
@@ -681,6 +692,7 @@
             <w:pPr>
               <w:pStyle w:val="Normal"/>
               <w:widowControl/>
+              <w:suppressAutoHyphens w:val="true"/>
               <w:spacing w:lineRule="auto" w:line="240" w:before="0" w:after="0"/>
               <w:jc w:val="center"/>
               <w:rPr>
@@ -715,6 +727,7 @@
             <w:pPr>
               <w:pStyle w:val="Normal"/>
               <w:widowControl/>
+              <w:suppressAutoHyphens w:val="true"/>
               <w:spacing w:lineRule="auto" w:line="240" w:before="0" w:after="0"/>
               <w:jc w:val="center"/>
               <w:rPr>
@@ -749,6 +762,7 @@
             <w:pPr>
               <w:pStyle w:val="Normal"/>
               <w:widowControl/>
+              <w:suppressAutoHyphens w:val="true"/>
               <w:spacing w:lineRule="auto" w:line="240" w:before="0" w:after="0"/>
               <w:jc w:val="center"/>
               <w:rPr>
@@ -767,17 +781,7 @@
                 <w:szCs w:val="20"/>
                 <w:lang w:val="en-US" w:eastAsia="en-US" w:bidi="ar-SA"/>
               </w:rPr>
-              <w:t xml:space="preserve">Що </w:t>
-            </w:r>
-            <w:r>
-              <w:rPr>
-                <w:rFonts w:eastAsia="ＭＳ 明朝" w:cs="" w:ascii="FreeSans" w:hAnsi="FreeSans"/>
-                <w:kern w:val="0"/>
-                <w:sz w:val="20"/>
-                <w:szCs w:val="20"/>
-                <w:lang w:val="en-US" w:eastAsia="en-US" w:bidi="ar-SA"/>
-              </w:rPr>
-              <w:t>контролювати</w:t>
+              <w:t>Що контролювати</w:t>
             </w:r>
           </w:p>
         </w:tc>
@@ -790,6 +794,7 @@
             <w:pPr>
               <w:pStyle w:val="Normal"/>
               <w:widowControl/>
+              <w:suppressAutoHyphens w:val="true"/>
               <w:spacing w:lineRule="auto" w:line="240" w:before="0" w:after="0"/>
               <w:jc w:val="center"/>
               <w:rPr>
@@ -821,6 +826,7 @@
             <w:pPr>
               <w:pStyle w:val="Normal"/>
               <w:widowControl/>
+              <w:suppressAutoHyphens w:val="true"/>
               <w:spacing w:lineRule="auto" w:line="240" w:before="0" w:after="0"/>
               <w:jc w:val="center"/>
               <w:rPr>
@@ -846,13 +852,14 @@
         </w:tc>
         <w:tc>
           <w:tcPr>
-            <w:tcW w:w="893" w:type="dxa"/>
+            <w:tcW w:w="892" w:type="dxa"/>
             <w:tcBorders/>
           </w:tcPr>
           <w:p>
             <w:pPr>
               <w:pStyle w:val="Normal"/>
               <w:widowControl/>
+              <w:suppressAutoHyphens w:val="true"/>
               <w:spacing w:lineRule="auto" w:line="240" w:before="0" w:after="0"/>
               <w:jc w:val="center"/>
               <w:rPr>
@@ -889,6 +896,7 @@
             <w:pPr>
               <w:pStyle w:val="Normal"/>
               <w:widowControl/>
+              <w:suppressAutoHyphens w:val="true"/>
               <w:spacing w:lineRule="auto" w:line="240" w:before="0" w:after="0"/>
               <w:jc w:val="left"/>
               <w:rPr>
@@ -921,6 +929,7 @@
             <w:pPr>
               <w:pStyle w:val="Normal"/>
               <w:widowControl/>
+              <w:suppressAutoHyphens w:val="true"/>
               <w:spacing w:lineRule="auto" w:line="240" w:before="0" w:after="0"/>
               <w:jc w:val="left"/>
               <w:rPr>
@@ -956,6 +965,7 @@
             <w:pPr>
               <w:pStyle w:val="Normal"/>
               <w:widowControl/>
+              <w:suppressAutoHyphens w:val="true"/>
               <w:spacing w:lineRule="auto" w:line="240" w:before="0" w:after="0"/>
               <w:jc w:val="left"/>
               <w:rPr>
@@ -990,6 +1000,7 @@
             <w:pPr>
               <w:pStyle w:val="Normal"/>
               <w:widowControl/>
+              <w:suppressAutoHyphens w:val="true"/>
               <w:spacing w:lineRule="auto" w:line="240" w:before="0" w:after="0"/>
               <w:jc w:val="left"/>
               <w:rPr>
@@ -1008,27 +1019,7 @@
                 <w:szCs w:val="20"/>
                 <w:lang w:val="en-US" w:eastAsia="en-US" w:bidi="ar-SA"/>
               </w:rPr>
-              <w:t xml:space="preserve">Останній </w:t>
-            </w:r>
-            <w:r>
-              <w:rPr>
-                <w:rFonts w:eastAsia="ＭＳ 明朝" w:cs="" w:ascii="FreeSans" w:hAnsi="FreeSans"/>
-                <w:kern w:val="0"/>
-                <w:sz w:val="20"/>
-                <w:szCs w:val="20"/>
-                <w:lang w:val="en-US" w:eastAsia="en-US" w:bidi="ar-SA"/>
-              </w:rPr>
-              <w:t>win_</w:t>
-            </w:r>
-            <w:r>
-              <w:rPr>
-                <w:rFonts w:eastAsia="ＭＳ 明朝" w:cs="" w:ascii="FreeSans" w:hAnsi="FreeSans"/>
-                <w:kern w:val="0"/>
-                <w:sz w:val="20"/>
-                <w:szCs w:val="20"/>
-                <w:lang w:val="en-US" w:eastAsia="en-US" w:bidi="ar-SA"/>
-              </w:rPr>
-              <w:t>streak сесії</w:t>
+              <w:t>Останній win_streak сесії</w:t>
             </w:r>
           </w:p>
         </w:tc>
@@ -1042,6 +1033,7 @@
             <w:pPr>
               <w:pStyle w:val="Normal"/>
               <w:widowControl/>
+              <w:suppressAutoHyphens w:val="true"/>
               <w:spacing w:lineRule="auto" w:line="240" w:before="0" w:after="0"/>
               <w:jc w:val="left"/>
               <w:rPr>
@@ -1060,27 +1052,7 @@
                 <w:szCs w:val="20"/>
                 <w:lang w:val="en-US" w:eastAsia="en-US" w:bidi="ar-SA"/>
               </w:rPr>
-              <w:t>Session.max_</w:t>
-            </w:r>
-            <w:r>
-              <w:rPr>
-                <w:rFonts w:eastAsia="ＭＳ 明朝" w:cs="" w:ascii="FreeSans" w:hAnsi="FreeSans"/>
-                <w:kern w:val="0"/>
-                <w:sz w:val="20"/>
-                <w:szCs w:val="20"/>
-                <w:lang w:val="en-US" w:eastAsia="en-US" w:bidi="ar-SA"/>
-              </w:rPr>
-              <w:t>win_</w:t>
-            </w:r>
-            <w:r>
-              <w:rPr>
-                <w:rFonts w:eastAsia="ＭＳ 明朝" w:cs="" w:ascii="FreeSans" w:hAnsi="FreeSans"/>
-                <w:kern w:val="0"/>
-                <w:sz w:val="20"/>
-                <w:szCs w:val="20"/>
-                <w:lang w:val="en-US" w:eastAsia="en-US" w:bidi="ar-SA"/>
-              </w:rPr>
-              <w:t>streak</w:t>
+              <w:t>Session.max_win_streak</w:t>
             </w:r>
           </w:p>
         </w:tc>
@@ -1094,6 +1066,7 @@
             <w:pPr>
               <w:pStyle w:val="Normal"/>
               <w:widowControl/>
+              <w:suppressAutoHyphens w:val="true"/>
               <w:spacing w:lineRule="auto" w:line="240" w:before="0" w:after="0"/>
               <w:jc w:val="left"/>
               <w:rPr>
@@ -1112,163 +1085,13 @@
                 <w:szCs w:val="20"/>
                 <w:lang w:val="en-US" w:eastAsia="en-US" w:bidi="ar-SA"/>
               </w:rPr>
-              <w:t>Підтягнути під час створення сесії з achievements</w:t>
-            </w:r>
-            <w:r>
-              <w:rPr>
-                <w:rFonts w:eastAsia="ＭＳ 明朝" w:cs="" w:ascii="FreeSans" w:hAnsi="FreeSans"/>
-                <w:kern w:val="0"/>
-                <w:sz w:val="20"/>
-                <w:szCs w:val="20"/>
-                <w:lang w:val="en-US" w:eastAsia="en-US" w:bidi="ar-SA"/>
-              </w:rPr>
-              <w:t>_profile</w:t>
-            </w:r>
-            <w:r>
-              <w:rPr>
-                <w:rFonts w:eastAsia="ＭＳ 明朝" w:cs="" w:ascii="FreeSans" w:hAnsi="FreeSans"/>
-                <w:kern w:val="0"/>
-                <w:sz w:val="20"/>
-                <w:szCs w:val="20"/>
-                <w:lang w:val="en-US" w:eastAsia="en-US" w:bidi="ar-SA"/>
-              </w:rPr>
-              <w:t>.</w:t>
-            </w:r>
-            <w:r>
-              <w:rPr>
-                <w:rFonts w:eastAsia="ＭＳ 明朝" w:cs="" w:ascii="FreeSans" w:hAnsi="FreeSans"/>
-                <w:kern w:val="0"/>
-                <w:sz w:val="20"/>
-                <w:szCs w:val="20"/>
-                <w:lang w:val="en-US" w:eastAsia="en-US" w:bidi="ar-SA"/>
-              </w:rPr>
-              <w:t>max_</w:t>
-            </w:r>
-            <w:r>
-              <w:rPr>
-                <w:rFonts w:eastAsia="ＭＳ 明朝" w:cs="" w:ascii="FreeSans" w:hAnsi="FreeSans"/>
-                <w:kern w:val="0"/>
-                <w:sz w:val="20"/>
-                <w:szCs w:val="20"/>
-                <w:lang w:val="en-US" w:eastAsia="en-US" w:bidi="ar-SA"/>
-              </w:rPr>
-              <w:t>win_</w:t>
-            </w:r>
-            <w:r>
-              <w:rPr>
-                <w:rFonts w:eastAsia="ＭＳ 明朝" w:cs="" w:ascii="FreeSans" w:hAnsi="FreeSans"/>
-                <w:kern w:val="0"/>
-                <w:sz w:val="20"/>
-                <w:szCs w:val="20"/>
-                <w:lang w:val="en-US" w:eastAsia="en-US" w:bidi="ar-SA"/>
-              </w:rPr>
-              <w:t xml:space="preserve">streak </w:t>
-            </w:r>
-            <w:r>
-              <w:rPr>
-                <w:rFonts w:eastAsia="ＭＳ 明朝" w:cs="" w:ascii="FreeSans" w:hAnsi="FreeSans"/>
-                <w:kern w:val="0"/>
-                <w:sz w:val="20"/>
-                <w:szCs w:val="20"/>
-                <w:lang w:val="en-US" w:eastAsia="en-US" w:bidi="ar-SA"/>
-              </w:rPr>
-              <w:t xml:space="preserve">у Session, у випадку нового рекорду оновити </w:t>
-            </w:r>
-            <w:r>
-              <w:rPr>
-                <w:rFonts w:eastAsia="ＭＳ 明朝" w:cs="" w:ascii="FreeSans" w:hAnsi="FreeSans"/>
-                <w:kern w:val="0"/>
-                <w:sz w:val="20"/>
-                <w:szCs w:val="20"/>
-                <w:lang w:val="en-US" w:eastAsia="en-US" w:bidi="ar-SA"/>
-              </w:rPr>
-              <w:t>Session.max_</w:t>
-            </w:r>
-            <w:r>
-              <w:rPr>
-                <w:rFonts w:eastAsia="ＭＳ 明朝" w:cs="" w:ascii="FreeSans" w:hAnsi="FreeSans"/>
-                <w:kern w:val="0"/>
-                <w:sz w:val="20"/>
-                <w:szCs w:val="20"/>
-                <w:lang w:val="en-US" w:eastAsia="en-US" w:bidi="ar-SA"/>
-              </w:rPr>
-              <w:t>win_</w:t>
-            </w:r>
-            <w:r>
-              <w:rPr>
-                <w:rFonts w:eastAsia="ＭＳ 明朝" w:cs="" w:ascii="FreeSans" w:hAnsi="FreeSans"/>
-                <w:kern w:val="0"/>
-                <w:sz w:val="20"/>
-                <w:szCs w:val="20"/>
-                <w:lang w:val="en-US" w:eastAsia="en-US" w:bidi="ar-SA"/>
-              </w:rPr>
-              <w:t xml:space="preserve">streak </w:t>
-            </w:r>
-            <w:r>
-              <w:rPr>
-                <w:rFonts w:eastAsia="ＭＳ 明朝" w:cs="" w:ascii="FreeSans" w:hAnsi="FreeSans"/>
-                <w:kern w:val="0"/>
-                <w:sz w:val="20"/>
-                <w:szCs w:val="20"/>
-                <w:lang w:val="en-US" w:eastAsia="en-US" w:bidi="ar-SA"/>
-              </w:rPr>
-              <w:t>і  achievements</w:t>
-            </w:r>
-            <w:r>
-              <w:rPr>
-                <w:rFonts w:eastAsia="ＭＳ 明朝" w:cs="" w:ascii="FreeSans" w:hAnsi="FreeSans"/>
-                <w:kern w:val="0"/>
-                <w:sz w:val="20"/>
-                <w:szCs w:val="20"/>
-                <w:lang w:val="en-US" w:eastAsia="en-US" w:bidi="ar-SA"/>
-              </w:rPr>
-              <w:t>_profile</w:t>
-            </w:r>
-            <w:r>
-              <w:rPr>
-                <w:rFonts w:eastAsia="ＭＳ 明朝" w:cs="" w:ascii="FreeSans" w:hAnsi="FreeSans"/>
-                <w:kern w:val="0"/>
-                <w:sz w:val="20"/>
-                <w:szCs w:val="20"/>
-                <w:lang w:val="en-US" w:eastAsia="en-US" w:bidi="ar-SA"/>
-              </w:rPr>
-              <w:t>.</w:t>
-            </w:r>
-            <w:r>
-              <w:rPr>
-                <w:rFonts w:eastAsia="ＭＳ 明朝" w:cs="" w:ascii="FreeSans" w:hAnsi="FreeSans"/>
-                <w:kern w:val="0"/>
-                <w:sz w:val="20"/>
-                <w:szCs w:val="20"/>
-                <w:lang w:val="en-US" w:eastAsia="en-US" w:bidi="ar-SA"/>
-              </w:rPr>
-              <w:t>max_</w:t>
-            </w:r>
-            <w:r>
-              <w:rPr>
-                <w:rFonts w:eastAsia="ＭＳ 明朝" w:cs="" w:ascii="FreeSans" w:hAnsi="FreeSans"/>
-                <w:kern w:val="0"/>
-                <w:sz w:val="20"/>
-                <w:szCs w:val="20"/>
-                <w:lang w:val="en-US" w:eastAsia="en-US" w:bidi="ar-SA"/>
-              </w:rPr>
-              <w:t>win_</w:t>
-            </w:r>
-            <w:r>
-              <w:rPr>
-                <w:rFonts w:eastAsia="ＭＳ 明朝" w:cs="" w:ascii="FreeSans" w:hAnsi="FreeSans"/>
-                <w:kern w:val="0"/>
-                <w:sz w:val="20"/>
-                <w:szCs w:val="20"/>
-                <w:lang w:val="en-US" w:eastAsia="en-US" w:bidi="ar-SA"/>
-              </w:rPr>
-              <w:t>streak</w:t>
+              <w:t>Підтягнути під час створення сесії з achievements_profile.max_win_streak у Session, у випадку нового рекорду оновити Session.max_win_streak і  achievements_profile.max_win_streak</w:t>
             </w:r>
           </w:p>
         </w:tc>
         <w:tc>
           <w:tcPr>
-            <w:tcW w:w="893" w:type="dxa"/>
+            <w:tcW w:w="892" w:type="dxa"/>
             <w:tcBorders/>
             <w:vAlign w:val="center"/>
           </w:tcPr>
@@ -1276,6 +1099,7 @@
             <w:pPr>
               <w:pStyle w:val="Normal"/>
               <w:widowControl/>
+              <w:suppressAutoHyphens w:val="true"/>
               <w:spacing w:lineRule="auto" w:line="240" w:before="0" w:after="0"/>
               <w:jc w:val="left"/>
               <w:rPr>
@@ -1311,6 +1135,7 @@
             <w:pPr>
               <w:pStyle w:val="Normal"/>
               <w:widowControl/>
+              <w:suppressAutoHyphens w:val="true"/>
               <w:spacing w:lineRule="auto" w:line="240" w:before="0" w:after="0"/>
               <w:jc w:val="left"/>
               <w:rPr>
@@ -1343,6 +1168,7 @@
             <w:pPr>
               <w:pStyle w:val="Normal"/>
               <w:widowControl/>
+              <w:suppressAutoHyphens w:val="true"/>
               <w:spacing w:lineRule="auto" w:line="240" w:before="0" w:after="0"/>
               <w:jc w:val="left"/>
               <w:rPr>
@@ -1378,6 +1204,7 @@
             <w:pPr>
               <w:pStyle w:val="Normal"/>
               <w:widowControl/>
+              <w:suppressAutoHyphens w:val="true"/>
               <w:spacing w:lineRule="auto" w:line="240" w:before="0" w:after="0"/>
               <w:jc w:val="left"/>
               <w:rPr>
@@ -1411,6 +1238,7 @@
             <w:pPr>
               <w:pStyle w:val="Normal"/>
               <w:widowControl/>
+              <w:suppressAutoHyphens w:val="true"/>
               <w:spacing w:lineRule="auto" w:line="240" w:before="0" w:after="0"/>
               <w:jc w:val="left"/>
               <w:rPr>
@@ -1429,27 +1257,7 @@
                 <w:szCs w:val="20"/>
                 <w:lang w:val="en-US" w:eastAsia="en-US" w:bidi="ar-SA"/>
               </w:rPr>
-              <w:t xml:space="preserve">Останній </w:t>
-            </w:r>
-            <w:r>
-              <w:rPr>
-                <w:rFonts w:eastAsia="ＭＳ 明朝" w:cs="" w:ascii="FreeSans" w:hAnsi="FreeSans"/>
-                <w:kern w:val="0"/>
-                <w:sz w:val="20"/>
-                <w:szCs w:val="20"/>
-                <w:lang w:val="en-US" w:eastAsia="en-US" w:bidi="ar-SA"/>
-              </w:rPr>
-              <w:t>lose_</w:t>
-            </w:r>
-            <w:r>
-              <w:rPr>
-                <w:rFonts w:eastAsia="ＭＳ 明朝" w:cs="" w:ascii="FreeSans" w:hAnsi="FreeSans"/>
-                <w:kern w:val="0"/>
-                <w:sz w:val="20"/>
-                <w:szCs w:val="20"/>
-                <w:lang w:val="en-US" w:eastAsia="en-US" w:bidi="ar-SA"/>
-              </w:rPr>
-              <w:t>streak сесії</w:t>
+              <w:t>Останній lose_streak сесії</w:t>
             </w:r>
           </w:p>
         </w:tc>
@@ -1463,6 +1271,7 @@
             <w:pPr>
               <w:pStyle w:val="Normal"/>
               <w:widowControl/>
+              <w:suppressAutoHyphens w:val="true"/>
               <w:spacing w:lineRule="auto" w:line="240" w:before="0" w:after="0"/>
               <w:jc w:val="left"/>
               <w:rPr>
@@ -1481,27 +1290,7 @@
                 <w:szCs w:val="20"/>
                 <w:lang w:val="en-US" w:eastAsia="en-US" w:bidi="ar-SA"/>
               </w:rPr>
-              <w:t>Session.max_</w:t>
-            </w:r>
-            <w:r>
-              <w:rPr>
-                <w:rFonts w:eastAsia="ＭＳ 明朝" w:cs="" w:ascii="FreeSans" w:hAnsi="FreeSans"/>
-                <w:kern w:val="0"/>
-                <w:sz w:val="20"/>
-                <w:szCs w:val="20"/>
-                <w:lang w:val="en-US" w:eastAsia="en-US" w:bidi="ar-SA"/>
-              </w:rPr>
-              <w:t>lose_</w:t>
-            </w:r>
-            <w:r>
-              <w:rPr>
-                <w:rFonts w:eastAsia="ＭＳ 明朝" w:cs="" w:ascii="FreeSans" w:hAnsi="FreeSans"/>
-                <w:kern w:val="0"/>
-                <w:sz w:val="20"/>
-                <w:szCs w:val="20"/>
-                <w:lang w:val="en-US" w:eastAsia="en-US" w:bidi="ar-SA"/>
-              </w:rPr>
-              <w:t>streak</w:t>
+              <w:t>Session.max_lose_streak</w:t>
             </w:r>
           </w:p>
         </w:tc>
@@ -1515,6 +1304,7 @@
             <w:pPr>
               <w:pStyle w:val="Normal"/>
               <w:widowControl/>
+              <w:suppressAutoHyphens w:val="true"/>
               <w:spacing w:lineRule="auto" w:line="240" w:before="0" w:after="0"/>
               <w:jc w:val="left"/>
               <w:rPr>
@@ -1533,43 +1323,13 @@
                 <w:szCs w:val="20"/>
                 <w:lang w:val="en-US" w:eastAsia="en-US" w:bidi="ar-SA"/>
               </w:rPr>
-              <w:t xml:space="preserve">Теж саме, тільки з </w:t>
-            </w:r>
-            <w:r>
-              <w:rPr>
-                <w:rFonts w:eastAsia="ＭＳ 明朝" w:cs="" w:ascii="FreeSans" w:hAnsi="FreeSans"/>
-                <w:kern w:val="0"/>
-                <w:sz w:val="20"/>
-                <w:szCs w:val="20"/>
-                <w:lang w:val="en-US" w:eastAsia="en-US" w:bidi="ar-SA"/>
-              </w:rPr>
-              <w:t>max_</w:t>
-            </w:r>
-            <w:r>
-              <w:rPr>
-                <w:rFonts w:eastAsia="ＭＳ 明朝" w:cs="" w:ascii="FreeSans" w:hAnsi="FreeSans"/>
-                <w:kern w:val="0"/>
-                <w:sz w:val="20"/>
-                <w:szCs w:val="20"/>
-                <w:lang w:val="en-US" w:eastAsia="en-US" w:bidi="ar-SA"/>
-              </w:rPr>
-              <w:t>lose_</w:t>
-            </w:r>
-            <w:r>
-              <w:rPr>
-                <w:rFonts w:eastAsia="ＭＳ 明朝" w:cs="" w:ascii="FreeSans" w:hAnsi="FreeSans"/>
-                <w:kern w:val="0"/>
-                <w:sz w:val="20"/>
-                <w:szCs w:val="20"/>
-                <w:lang w:val="en-US" w:eastAsia="en-US" w:bidi="ar-SA"/>
-              </w:rPr>
-              <w:t>streak</w:t>
+              <w:t>Теж саме, тільки з max_lose_streak</w:t>
             </w:r>
           </w:p>
         </w:tc>
         <w:tc>
           <w:tcPr>
-            <w:tcW w:w="893" w:type="dxa"/>
+            <w:tcW w:w="892" w:type="dxa"/>
             <w:tcBorders/>
             <w:vAlign w:val="center"/>
           </w:tcPr>
@@ -1577,6 +1337,7 @@
             <w:pPr>
               <w:pStyle w:val="Normal"/>
               <w:widowControl/>
+              <w:suppressAutoHyphens w:val="true"/>
               <w:spacing w:lineRule="auto" w:line="240" w:before="0" w:after="0"/>
               <w:jc w:val="left"/>
               <w:rPr>
@@ -1612,6 +1373,7 @@
             <w:pPr>
               <w:pStyle w:val="Normal"/>
               <w:widowControl/>
+              <w:suppressAutoHyphens w:val="true"/>
               <w:spacing w:lineRule="auto" w:line="240" w:before="0" w:after="0"/>
               <w:jc w:val="left"/>
               <w:rPr>
@@ -1644,6 +1406,7 @@
             <w:pPr>
               <w:pStyle w:val="Normal"/>
               <w:widowControl/>
+              <w:suppressAutoHyphens w:val="true"/>
               <w:spacing w:lineRule="auto" w:line="240" w:before="0" w:after="0"/>
               <w:jc w:val="left"/>
               <w:rPr>
@@ -1679,6 +1442,7 @@
             <w:pPr>
               <w:pStyle w:val="Normal"/>
               <w:widowControl/>
+              <w:suppressAutoHyphens w:val="true"/>
               <w:spacing w:lineRule="auto" w:line="240" w:before="0" w:after="0"/>
               <w:jc w:val="left"/>
               <w:rPr>
@@ -1702,7 +1466,7 @@
         </w:tc>
         <w:tc>
           <w:tcPr>
-            <w:tcW w:w="9054" w:type="dxa"/>
+            <w:tcW w:w="9053" w:type="dxa"/>
             <w:gridSpan w:val="4"/>
             <w:vMerge w:val="restart"/>
             <w:tcBorders/>
@@ -1712,6 +1476,7 @@
             <w:pPr>
               <w:pStyle w:val="Normal"/>
               <w:widowControl/>
+              <w:suppressAutoHyphens w:val="true"/>
               <w:spacing w:lineRule="auto" w:line="240" w:before="0" w:after="0"/>
               <w:jc w:val="left"/>
               <w:rPr>
@@ -1747,6 +1512,7 @@
             <w:pPr>
               <w:pStyle w:val="Normal"/>
               <w:widowControl/>
+              <w:suppressAutoHyphens w:val="true"/>
               <w:spacing w:lineRule="auto" w:line="240" w:before="0" w:after="0"/>
               <w:jc w:val="left"/>
               <w:rPr>
@@ -1779,6 +1545,7 @@
             <w:pPr>
               <w:pStyle w:val="Normal"/>
               <w:widowControl/>
+              <w:suppressAutoHyphens w:val="true"/>
               <w:spacing w:lineRule="auto" w:line="240" w:before="0" w:after="0"/>
               <w:jc w:val="left"/>
               <w:rPr>
@@ -1814,6 +1581,7 @@
             <w:pPr>
               <w:pStyle w:val="Normal"/>
               <w:widowControl/>
+              <w:suppressAutoHyphens w:val="true"/>
               <w:spacing w:lineRule="auto" w:line="240" w:before="0" w:after="0"/>
               <w:jc w:val="left"/>
               <w:rPr>
@@ -1837,7 +1605,7 @@
         </w:tc>
         <w:tc>
           <w:tcPr>
-            <w:tcW w:w="9054" w:type="dxa"/>
+            <w:tcW w:w="9053" w:type="dxa"/>
             <w:gridSpan w:val="4"/>
             <w:vMerge w:val="continue"/>
             <w:tcBorders/>
@@ -1847,6 +1615,7 @@
             <w:pPr>
               <w:pStyle w:val="Normal"/>
               <w:widowControl/>
+              <w:suppressAutoHyphens w:val="true"/>
               <w:spacing w:lineRule="auto" w:line="240" w:before="0" w:after="0"/>
               <w:jc w:val="left"/>
               <w:rPr>
@@ -1865,6 +1634,496 @@
                 <w:szCs w:val="20"/>
                 <w:lang w:val="en-US" w:eastAsia="en-US" w:bidi="ar-SA"/>
               </w:rPr>
+            </w:r>
+          </w:p>
+        </w:tc>
+      </w:tr>
+      <w:tr>
+        <w:trPr/>
+        <w:tc>
+          <w:tcPr>
+            <w:tcW w:w="460" w:type="dxa"/>
+            <w:vMerge w:val="restart"/>
+            <w:tcBorders/>
+            <w:vAlign w:val="center"/>
+          </w:tcPr>
+          <w:p>
+            <w:pPr>
+              <w:pStyle w:val="Normal"/>
+              <w:widowControl/>
+              <w:suppressAutoHyphens w:val="true"/>
+              <w:spacing w:lineRule="auto" w:line="240" w:before="0" w:after="0"/>
+              <w:jc w:val="left"/>
+              <w:rPr>
+                <w:rFonts w:ascii="FreeSans" w:hAnsi="FreeSans" w:eastAsia="ＭＳ 明朝" w:cs=""/>
+                <w:kern w:val="0"/>
+                <w:sz w:val="20"/>
+                <w:szCs w:val="20"/>
+                <w:lang w:val="en-US" w:eastAsia="en-US" w:bidi="ar-SA"/>
+              </w:rPr>
+            </w:pPr>
+            <w:r>
+              <w:rPr>
+                <w:rFonts w:eastAsia="ＭＳ 明朝" w:cs="" w:ascii="FreeSans" w:hAnsi="FreeSans"/>
+                <w:kern w:val="0"/>
+                <w:sz w:val="20"/>
+                <w:szCs w:val="20"/>
+                <w:lang w:val="en-US" w:eastAsia="en-US" w:bidi="ar-SA"/>
+              </w:rPr>
+              <w:t>5</w:t>
+            </w:r>
+          </w:p>
+        </w:tc>
+        <w:tc>
+          <w:tcPr>
+            <w:tcW w:w="1861" w:type="dxa"/>
+            <w:vMerge w:val="restart"/>
+            <w:tcBorders/>
+            <w:vAlign w:val="center"/>
+          </w:tcPr>
+          <w:p>
+            <w:pPr>
+              <w:pStyle w:val="Normal"/>
+              <w:widowControl/>
+              <w:suppressAutoHyphens w:val="true"/>
+              <w:spacing w:lineRule="auto" w:line="240" w:before="0" w:after="0"/>
+              <w:jc w:val="left"/>
+              <w:rPr>
+                <w:rFonts w:ascii="FreeSans" w:hAnsi="FreeSans" w:eastAsia="ＭＳ 明朝" w:cs=""/>
+                <w:kern w:val="0"/>
+                <w:sz w:val="20"/>
+                <w:szCs w:val="20"/>
+                <w:lang w:val="en-US" w:eastAsia="en-US" w:bidi="ar-SA"/>
+              </w:rPr>
+            </w:pPr>
+            <w:r>
+              <w:rPr>
+                <w:rFonts w:eastAsia="ＭＳ 明朝" w:cs="" w:ascii="FreeSans" w:hAnsi="FreeSans"/>
+                <w:kern w:val="0"/>
+                <w:sz w:val="20"/>
+                <w:szCs w:val="20"/>
+                <w:lang w:val="en-US" w:eastAsia="en-US" w:bidi="ar-SA"/>
+              </w:rPr>
+              <w:t>Найкраща сесія</w:t>
+            </w:r>
+          </w:p>
+        </w:tc>
+        <w:tc>
+          <w:tcPr>
+            <w:tcW w:w="1697" w:type="dxa"/>
+            <w:tcBorders>
+              <w:right w:val="nil"/>
+            </w:tcBorders>
+            <w:vAlign w:val="center"/>
+          </w:tcPr>
+          <w:p>
+            <w:pPr>
+              <w:pStyle w:val="Normal"/>
+              <w:widowControl/>
+              <w:suppressAutoHyphens w:val="true"/>
+              <w:spacing w:lineRule="auto" w:line="240" w:before="0" w:after="0"/>
+              <w:jc w:val="left"/>
+              <w:rPr>
+                <w:rFonts w:ascii="FreeSans" w:hAnsi="FreeSans" w:eastAsia="ＭＳ 明朝" w:cs=""/>
+                <w:kern w:val="0"/>
+                <w:sz w:val="20"/>
+                <w:szCs w:val="20"/>
+                <w:lang w:val="en-US" w:eastAsia="en-US" w:bidi="ar-SA"/>
+              </w:rPr>
+            </w:pPr>
+            <w:r>
+              <w:rPr>
+                <w:rFonts w:eastAsia="ＭＳ 明朝" w:cs="" w:ascii="FreeSans" w:hAnsi="FreeSans"/>
+                <w:kern w:val="0"/>
+                <w:sz w:val="20"/>
+                <w:szCs w:val="20"/>
+                <w:lang w:val="en-US" w:eastAsia="en-US" w:bidi="ar-SA"/>
+              </w:rPr>
+              <w:t>Запуск додатку</w:t>
+            </w:r>
+          </w:p>
+        </w:tc>
+        <w:tc>
+          <w:tcPr>
+            <w:tcW w:w="1473" w:type="dxa"/>
+            <w:tcBorders>
+              <w:right w:val="nil"/>
+            </w:tcBorders>
+            <w:vAlign w:val="center"/>
+          </w:tcPr>
+          <w:p>
+            <w:pPr>
+              <w:pStyle w:val="Normal"/>
+              <w:widowControl/>
+              <w:suppressAutoHyphens w:val="true"/>
+              <w:spacing w:lineRule="auto" w:line="240" w:before="0" w:after="0"/>
+              <w:jc w:val="left"/>
+              <w:rPr>
+                <w:rFonts w:ascii="FreeSans" w:hAnsi="FreeSans" w:eastAsia="ＭＳ 明朝" w:cs=""/>
+                <w:kern w:val="0"/>
+                <w:sz w:val="20"/>
+                <w:szCs w:val="20"/>
+                <w:lang w:val="en-US" w:eastAsia="en-US" w:bidi="ar-SA"/>
+              </w:rPr>
+            </w:pPr>
+            <w:r>
+              <w:rPr>
+                <w:rFonts w:eastAsia="ＭＳ 明朝" w:cs="" w:ascii="FreeSans" w:hAnsi="FreeSans"/>
+                <w:kern w:val="0"/>
+                <w:sz w:val="20"/>
+                <w:szCs w:val="20"/>
+                <w:lang w:val="en-US" w:eastAsia="en-US" w:bidi="ar-SA"/>
+              </w:rPr>
+              <w:t>Щільність сесії</w:t>
+            </w:r>
+          </w:p>
+        </w:tc>
+        <w:tc>
+          <w:tcPr>
+            <w:tcW w:w="1705" w:type="dxa"/>
+            <w:tcBorders/>
+            <w:vAlign w:val="center"/>
+          </w:tcPr>
+          <w:p>
+            <w:pPr>
+              <w:pStyle w:val="Normal"/>
+              <w:widowControl/>
+              <w:suppressAutoHyphens w:val="true"/>
+              <w:spacing w:lineRule="auto" w:line="240" w:before="0" w:after="0"/>
+              <w:jc w:val="left"/>
+              <w:rPr>
+                <w:rFonts w:ascii="FreeSans" w:hAnsi="FreeSans" w:eastAsia="ＭＳ 明朝" w:cs=""/>
+                <w:kern w:val="0"/>
+                <w:sz w:val="20"/>
+                <w:szCs w:val="20"/>
+                <w:lang w:val="en-US" w:eastAsia="en-US" w:bidi="ar-SA"/>
+              </w:rPr>
+            </w:pPr>
+            <w:r>
+              <w:rPr>
+                <w:rFonts w:eastAsia="ＭＳ 明朝" w:cs="" w:ascii="FreeSans" w:hAnsi="FreeSans"/>
+                <w:kern w:val="0"/>
+                <w:sz w:val="20"/>
+                <w:szCs w:val="20"/>
+                <w:lang w:val="en-US" w:eastAsia="en-US" w:bidi="ar-SA"/>
+              </w:rPr>
+              <w:t>achivements_profile.best_density</w:t>
+            </w:r>
+          </w:p>
+        </w:tc>
+        <w:tc>
+          <w:tcPr>
+            <w:tcW w:w="4983" w:type="dxa"/>
+            <w:tcBorders/>
+            <w:vAlign w:val="center"/>
+          </w:tcPr>
+          <w:p>
+            <w:pPr>
+              <w:pStyle w:val="Normal"/>
+              <w:widowControl/>
+              <w:suppressAutoHyphens w:val="true"/>
+              <w:spacing w:lineRule="auto" w:line="240" w:before="0" w:after="0"/>
+              <w:jc w:val="left"/>
+              <w:rPr>
+                <w:rFonts w:ascii="FreeSans" w:hAnsi="FreeSans" w:eastAsia="ＭＳ 明朝" w:cs=""/>
+                <w:kern w:val="0"/>
+                <w:sz w:val="20"/>
+                <w:szCs w:val="20"/>
+                <w:lang w:val="en-US" w:eastAsia="en-US" w:bidi="ar-SA"/>
+              </w:rPr>
+            </w:pPr>
+            <w:r>
+              <w:rPr>
+                <w:rFonts w:eastAsia="ＭＳ 明朝" w:cs="" w:ascii="FreeSans" w:hAnsi="FreeSans"/>
+                <w:kern w:val="0"/>
+                <w:sz w:val="20"/>
+                <w:szCs w:val="20"/>
+                <w:lang w:val="en-US" w:eastAsia="en-US" w:bidi="ar-SA"/>
+              </w:rPr>
+              <w:t>Під час запуску розрахувати щільність останньої сесії, порівняти з тим, що є у achivements_profile</w:t>
+            </w:r>
+          </w:p>
+        </w:tc>
+        <w:tc>
+          <w:tcPr>
+            <w:tcW w:w="892" w:type="dxa"/>
+            <w:tcBorders/>
+            <w:vAlign w:val="center"/>
+          </w:tcPr>
+          <w:p>
+            <w:pPr>
+              <w:pStyle w:val="Normal"/>
+              <w:widowControl/>
+              <w:suppressAutoHyphens w:val="true"/>
+              <w:spacing w:lineRule="auto" w:line="240" w:before="0" w:after="0"/>
+              <w:jc w:val="left"/>
+              <w:rPr>
+                <w:rFonts w:ascii="FreeSans" w:hAnsi="FreeSans" w:eastAsia="ＭＳ 明朝" w:cs=""/>
+                <w:kern w:val="0"/>
+                <w:sz w:val="20"/>
+                <w:szCs w:val="20"/>
+                <w:lang w:val="en-US" w:eastAsia="en-US" w:bidi="ar-SA"/>
+              </w:rPr>
+            </w:pPr>
+            <w:r>
+              <w:rPr>
+                <w:rFonts w:eastAsia="ＭＳ 明朝" w:cs="" w:ascii="FreeSans" w:hAnsi="FreeSans"/>
+                <w:kern w:val="0"/>
+                <w:sz w:val="20"/>
+                <w:szCs w:val="20"/>
+                <w:lang w:val="en-US" w:eastAsia="en-US" w:bidi="ar-SA"/>
+              </w:rPr>
+              <w:t>Ok</w:t>
+            </w:r>
+          </w:p>
+        </w:tc>
+      </w:tr>
+      <w:tr>
+        <w:trPr/>
+        <w:tc>
+          <w:tcPr>
+            <w:tcW w:w="460" w:type="dxa"/>
+            <w:vMerge w:val="continue"/>
+            <w:tcBorders/>
+            <w:vAlign w:val="center"/>
+          </w:tcPr>
+          <w:p>
+            <w:pPr>
+              <w:pStyle w:val="Normal"/>
+              <w:widowControl/>
+              <w:suppressAutoHyphens w:val="true"/>
+              <w:spacing w:lineRule="auto" w:line="240" w:before="0" w:after="0"/>
+              <w:jc w:val="left"/>
+              <w:rPr>
+                <w:rFonts w:ascii="FreeSans" w:hAnsi="FreeSans" w:eastAsia="ＭＳ 明朝" w:cs=""/>
+                <w:kern w:val="0"/>
+                <w:sz w:val="20"/>
+                <w:szCs w:val="20"/>
+                <w:lang w:val="en-US" w:eastAsia="en-US" w:bidi="ar-SA"/>
+              </w:rPr>
+            </w:pPr>
+            <w:r>
+              <w:rPr>
+                <w:rFonts w:eastAsia="ＭＳ 明朝" w:cs="" w:ascii="FreeSans" w:hAnsi="FreeSans"/>
+                <w:kern w:val="0"/>
+                <w:sz w:val="20"/>
+                <w:szCs w:val="20"/>
+                <w:lang w:val="en-US" w:eastAsia="en-US" w:bidi="ar-SA"/>
+              </w:rPr>
+            </w:r>
+          </w:p>
+        </w:tc>
+        <w:tc>
+          <w:tcPr>
+            <w:tcW w:w="1861" w:type="dxa"/>
+            <w:vMerge w:val="continue"/>
+            <w:tcBorders/>
+            <w:vAlign w:val="center"/>
+          </w:tcPr>
+          <w:p>
+            <w:pPr>
+              <w:pStyle w:val="Normal"/>
+              <w:widowControl/>
+              <w:suppressAutoHyphens w:val="true"/>
+              <w:spacing w:lineRule="auto" w:line="240" w:before="0" w:after="0"/>
+              <w:jc w:val="left"/>
+              <w:rPr>
+                <w:rFonts w:ascii="FreeSans" w:hAnsi="FreeSans" w:eastAsia="ＭＳ 明朝" w:cs=""/>
+                <w:kern w:val="0"/>
+                <w:sz w:val="20"/>
+                <w:szCs w:val="20"/>
+                <w:lang w:val="en-US" w:eastAsia="en-US" w:bidi="ar-SA"/>
+              </w:rPr>
+            </w:pPr>
+            <w:r>
+              <w:rPr>
+                <w:rFonts w:eastAsia="ＭＳ 明朝" w:cs="" w:ascii="FreeSans" w:hAnsi="FreeSans"/>
+                <w:kern w:val="0"/>
+                <w:sz w:val="20"/>
+                <w:szCs w:val="20"/>
+                <w:lang w:val="en-US" w:eastAsia="en-US" w:bidi="ar-SA"/>
+              </w:rPr>
+            </w:r>
+          </w:p>
+        </w:tc>
+        <w:tc>
+          <w:tcPr>
+            <w:tcW w:w="1697" w:type="dxa"/>
+            <w:tcBorders>
+              <w:top w:val="nil"/>
+              <w:right w:val="nil"/>
+            </w:tcBorders>
+            <w:vAlign w:val="center"/>
+          </w:tcPr>
+          <w:p>
+            <w:pPr>
+              <w:pStyle w:val="Normal"/>
+              <w:widowControl/>
+              <w:suppressAutoHyphens w:val="true"/>
+              <w:spacing w:lineRule="auto" w:line="240" w:before="0" w:after="0"/>
+              <w:jc w:val="left"/>
+              <w:rPr>
+                <w:rFonts w:ascii="FreeSans" w:hAnsi="FreeSans" w:eastAsia="ＭＳ 明朝" w:cs=""/>
+                <w:kern w:val="0"/>
+                <w:sz w:val="20"/>
+                <w:szCs w:val="20"/>
+                <w:lang w:val="en-US" w:eastAsia="en-US" w:bidi="ar-SA"/>
+              </w:rPr>
+            </w:pPr>
+            <w:r>
+              <w:rPr>
+                <w:rFonts w:eastAsia="ＭＳ 明朝" w:cs="" w:ascii="FreeSans" w:hAnsi="FreeSans"/>
+                <w:kern w:val="0"/>
+                <w:sz w:val="20"/>
+                <w:szCs w:val="20"/>
+                <w:lang w:val="en-US" w:eastAsia="en-US" w:bidi="ar-SA"/>
+              </w:rPr>
+              <w:t>Вихід з gameScreen</w:t>
+            </w:r>
+          </w:p>
+        </w:tc>
+        <w:tc>
+          <w:tcPr>
+            <w:tcW w:w="1473" w:type="dxa"/>
+            <w:tcBorders>
+              <w:top w:val="nil"/>
+              <w:right w:val="nil"/>
+            </w:tcBorders>
+            <w:vAlign w:val="center"/>
+          </w:tcPr>
+          <w:p>
+            <w:pPr>
+              <w:pStyle w:val="Normal"/>
+              <w:widowControl/>
+              <w:suppressAutoHyphens w:val="true"/>
+              <w:spacing w:lineRule="auto" w:line="240" w:before="0" w:after="0"/>
+              <w:jc w:val="left"/>
+              <w:rPr>
+                <w:rFonts w:ascii="FreeSans" w:hAnsi="FreeSans" w:eastAsia="ＭＳ 明朝" w:cs=""/>
+                <w:kern w:val="0"/>
+                <w:sz w:val="20"/>
+                <w:szCs w:val="20"/>
+                <w:lang w:val="en-US" w:eastAsia="en-US" w:bidi="ar-SA"/>
+              </w:rPr>
+            </w:pPr>
+            <w:r>
+              <w:rPr>
+                <w:rFonts w:eastAsia="ＭＳ 明朝" w:cs="" w:ascii="FreeSans" w:hAnsi="FreeSans"/>
+                <w:kern w:val="0"/>
+                <w:sz w:val="20"/>
+                <w:szCs w:val="20"/>
+                <w:lang w:val="en-US" w:eastAsia="en-US" w:bidi="ar-SA"/>
+              </w:rPr>
+              <w:t xml:space="preserve">Ймовірність повторити таку ж або краще </w:t>
+            </w:r>
+            <w:r>
+              <w:rPr>
+                <w:rFonts w:eastAsia="ＭＳ 明朝" w:cs="" w:ascii="FreeSans" w:hAnsi="FreeSans"/>
+                <w:kern w:val="0"/>
+                <w:sz w:val="20"/>
+                <w:szCs w:val="20"/>
+                <w:lang w:val="en-US" w:eastAsia="en-US" w:bidi="ar-SA"/>
+              </w:rPr>
+              <w:t>(Surprisal сесії)</w:t>
+            </w:r>
+          </w:p>
+        </w:tc>
+        <w:tc>
+          <w:tcPr>
+            <w:tcW w:w="1705" w:type="dxa"/>
+            <w:tcBorders>
+              <w:top w:val="nil"/>
+            </w:tcBorders>
+            <w:vAlign w:val="center"/>
+          </w:tcPr>
+          <w:p>
+            <w:pPr>
+              <w:pStyle w:val="Normal"/>
+              <w:widowControl/>
+              <w:suppressAutoHyphens w:val="true"/>
+              <w:spacing w:lineRule="auto" w:line="240" w:before="0" w:after="0"/>
+              <w:jc w:val="left"/>
+              <w:rPr>
+                <w:rFonts w:ascii="FreeSans" w:hAnsi="FreeSans" w:eastAsia="ＭＳ 明朝" w:cs=""/>
+                <w:kern w:val="0"/>
+                <w:sz w:val="20"/>
+                <w:szCs w:val="20"/>
+                <w:lang w:val="en-US" w:eastAsia="en-US" w:bidi="ar-SA"/>
+              </w:rPr>
+            </w:pPr>
+            <w:r>
+              <w:rPr>
+                <w:rFonts w:eastAsia="ＭＳ 明朝" w:cs="" w:ascii="FreeSans" w:hAnsi="FreeSans"/>
+                <w:kern w:val="0"/>
+                <w:sz w:val="20"/>
+                <w:szCs w:val="20"/>
+                <w:lang w:val="en-US" w:eastAsia="en-US" w:bidi="ar-SA"/>
+              </w:rPr>
+              <w:t>achivements_profile.best_probability</w:t>
+            </w:r>
+          </w:p>
+        </w:tc>
+        <w:tc>
+          <w:tcPr>
+            <w:tcW w:w="4983" w:type="dxa"/>
+            <w:tcBorders>
+              <w:top w:val="nil"/>
+            </w:tcBorders>
+            <w:vAlign w:val="center"/>
+          </w:tcPr>
+          <w:p>
+            <w:pPr>
+              <w:pStyle w:val="Normal"/>
+              <w:suppressAutoHyphens w:val="true"/>
+              <w:spacing w:lineRule="auto" w:line="240" w:before="0" w:after="0"/>
+              <w:rPr>
+                <w:rFonts w:ascii="FreeSans" w:hAnsi="FreeSans" w:eastAsia="ＭＳ 明朝"/>
+                <w:sz w:val="20"/>
+                <w:szCs w:val="20"/>
+              </w:rPr>
+            </w:pPr>
+            <w:r>
+              <w:rPr>
+                <w:rFonts w:eastAsia="ＭＳ 明朝" w:ascii="FreeSans" w:hAnsi="FreeSans"/>
+                <w:sz w:val="20"/>
+                <w:szCs w:val="20"/>
+              </w:rPr>
+              <w:t>Після виклику переходу на ЕФ, відмінну від gameScreen, розрахувати щільність останньої сесії, порівняти з тим, що є у achivements_profile</w:t>
+            </w:r>
+          </w:p>
+        </w:tc>
+        <w:tc>
+          <w:tcPr>
+            <w:tcW w:w="892" w:type="dxa"/>
+            <w:tcBorders>
+              <w:top w:val="nil"/>
+            </w:tcBorders>
+            <w:vAlign w:val="center"/>
+          </w:tcPr>
+          <w:p>
+            <w:pPr>
+              <w:pStyle w:val="Normal"/>
+              <w:widowControl/>
+              <w:suppressAutoHyphens w:val="true"/>
+              <w:spacing w:lineRule="auto" w:line="240" w:before="0" w:after="0"/>
+              <w:jc w:val="left"/>
+              <w:rPr>
+                <w:rFonts w:ascii="FreeSans" w:hAnsi="FreeSans" w:eastAsia="ＭＳ 明朝" w:cs=""/>
+                <w:kern w:val="0"/>
+                <w:sz w:val="20"/>
+                <w:szCs w:val="20"/>
+                <w:lang w:val="en-US" w:eastAsia="en-US" w:bidi="ar-SA"/>
+              </w:rPr>
+            </w:pPr>
+            <w:r>
+              <w:rPr>
+                <w:rFonts w:eastAsia="ＭＳ 明朝" w:cs="" w:ascii="FreeSans" w:hAnsi="FreeSans"/>
+                <w:kern w:val="0"/>
+                <w:sz w:val="20"/>
+                <w:szCs w:val="20"/>
+                <w:lang w:val="en-US" w:eastAsia="en-US" w:bidi="ar-SA"/>
+              </w:rPr>
+              <w:t>Ok</w:t>
             </w:r>
           </w:p>
         </w:tc>
@@ -1881,6 +2140,7 @@
             <w:pPr>
               <w:pStyle w:val="Normal"/>
               <w:widowControl/>
+              <w:suppressAutoHyphens w:val="true"/>
               <w:spacing w:lineRule="auto" w:line="240" w:before="0" w:after="0"/>
               <w:jc w:val="left"/>
               <w:rPr>
@@ -1899,7 +2159,7 @@
                 <w:szCs w:val="20"/>
                 <w:lang w:val="en-US" w:eastAsia="en-US" w:bidi="ar-SA"/>
               </w:rPr>
-              <w:t>5</w:t>
+              <w:t>6</w:t>
             </w:r>
           </w:p>
         </w:tc>
@@ -1913,6 +2173,7 @@
             <w:pPr>
               <w:pStyle w:val="Normal"/>
               <w:widowControl/>
+              <w:suppressAutoHyphens w:val="true"/>
               <w:spacing w:lineRule="auto" w:line="240" w:before="0" w:after="0"/>
               <w:jc w:val="left"/>
               <w:rPr>
@@ -1931,80 +2192,14 @@
                 <w:szCs w:val="20"/>
                 <w:lang w:val="en-US" w:eastAsia="en-US" w:bidi="ar-SA"/>
               </w:rPr>
-              <w:t>Найкраща сесія</w:t>
+              <w:t>Найгірша сесія</w:t>
             </w:r>
           </w:p>
         </w:tc>
         <w:tc>
           <w:tcPr>
-            <w:tcW w:w="1697" w:type="dxa"/>
-            <w:tcBorders>
-              <w:right w:val="nil"/>
-            </w:tcBorders>
-            <w:vAlign w:val="center"/>
-          </w:tcPr>
-          <w:p>
-            <w:pPr>
-              <w:pStyle w:val="Normal"/>
-              <w:widowControl/>
-              <w:spacing w:lineRule="auto" w:line="240" w:before="0" w:after="0"/>
-              <w:jc w:val="left"/>
-              <w:rPr>
-                <w:rFonts w:ascii="FreeSans" w:hAnsi="FreeSans" w:eastAsia="ＭＳ 明朝" w:cs=""/>
-                <w:kern w:val="0"/>
-                <w:sz w:val="20"/>
-                <w:szCs w:val="20"/>
-                <w:lang w:val="en-US" w:eastAsia="en-US" w:bidi="ar-SA"/>
-              </w:rPr>
-            </w:pPr>
-            <w:r>
-              <w:rPr>
-                <w:rFonts w:eastAsia="ＭＳ 明朝" w:cs="" w:ascii="FreeSans" w:hAnsi="FreeSans"/>
-                <w:kern w:val="0"/>
-                <w:sz w:val="20"/>
-                <w:szCs w:val="20"/>
-                <w:lang w:val="en-US" w:eastAsia="en-US" w:bidi="ar-SA"/>
-              </w:rPr>
-              <w:t>Завершення сесії</w:t>
-            </w:r>
-          </w:p>
-        </w:tc>
-        <w:tc>
-          <w:tcPr>
-            <w:tcW w:w="1473" w:type="dxa"/>
-            <w:tcBorders>
-              <w:right w:val="nil"/>
-            </w:tcBorders>
-            <w:vAlign w:val="center"/>
-          </w:tcPr>
-          <w:p>
-            <w:pPr>
-              <w:pStyle w:val="Normal"/>
-              <w:widowControl/>
-              <w:spacing w:lineRule="auto" w:line="240" w:before="0" w:after="0"/>
-              <w:jc w:val="left"/>
-              <w:rPr>
-                <w:rFonts w:ascii="FreeSans" w:hAnsi="FreeSans" w:eastAsia="ＭＳ 明朝" w:cs=""/>
-                <w:kern w:val="0"/>
-                <w:sz w:val="20"/>
-                <w:szCs w:val="20"/>
-                <w:lang w:val="en-US" w:eastAsia="en-US" w:bidi="ar-SA"/>
-              </w:rPr>
-            </w:pPr>
-            <w:r>
-              <w:rPr>
-                <w:rFonts w:eastAsia="ＭＳ 明朝" w:cs="" w:ascii="FreeSans" w:hAnsi="FreeSans"/>
-                <w:kern w:val="0"/>
-                <w:sz w:val="20"/>
-                <w:szCs w:val="20"/>
-                <w:lang w:val="en-US" w:eastAsia="en-US" w:bidi="ar-SA"/>
-              </w:rPr>
-            </w:r>
-          </w:p>
-        </w:tc>
-        <w:tc>
-          <w:tcPr>
-            <w:tcW w:w="1705" w:type="dxa"/>
+            <w:tcW w:w="10750" w:type="dxa"/>
+            <w:gridSpan w:val="5"/>
             <w:tcBorders/>
             <w:vAlign w:val="center"/>
           </w:tcPr>
@@ -2012,6 +2207,7 @@
             <w:pPr>
               <w:pStyle w:val="Normal"/>
               <w:widowControl/>
+              <w:suppressAutoHyphens w:val="true"/>
               <w:spacing w:lineRule="auto" w:line="240" w:before="0" w:after="0"/>
               <w:jc w:val="left"/>
               <w:rPr>
@@ -2030,69 +2226,7 @@
                 <w:szCs w:val="20"/>
                 <w:lang w:val="en-US" w:eastAsia="en-US" w:bidi="ar-SA"/>
               </w:rPr>
-            </w:r>
-          </w:p>
-        </w:tc>
-        <w:tc>
-          <w:tcPr>
-            <w:tcW w:w="4983" w:type="dxa"/>
-            <w:tcBorders/>
-            <w:vAlign w:val="center"/>
-          </w:tcPr>
-          <w:p>
-            <w:pPr>
-              <w:pStyle w:val="Normal"/>
-              <w:widowControl/>
-              <w:spacing w:lineRule="auto" w:line="240" w:before="0" w:after="0"/>
-              <w:jc w:val="left"/>
-              <w:rPr>
-                <w:rFonts w:ascii="FreeSans" w:hAnsi="FreeSans" w:eastAsia="ＭＳ 明朝" w:cs=""/>
-                <w:kern w:val="0"/>
-                <w:sz w:val="20"/>
-                <w:szCs w:val="20"/>
-                <w:lang w:val="en-US" w:eastAsia="en-US" w:bidi="ar-SA"/>
-              </w:rPr>
-            </w:pPr>
-            <w:r>
-              <w:rPr>
-                <w:rFonts w:eastAsia="ＭＳ 明朝" w:cs="" w:ascii="FreeSans" w:hAnsi="FreeSans"/>
-                <w:kern w:val="0"/>
-                <w:sz w:val="20"/>
-                <w:szCs w:val="20"/>
-                <w:lang w:val="en-US" w:eastAsia="en-US" w:bidi="ar-SA"/>
-              </w:rPr>
-              <w:t>Максимальна щільність сесії</w:t>
-            </w:r>
-          </w:p>
-        </w:tc>
-        <w:tc>
-          <w:tcPr>
-            <w:tcW w:w="893" w:type="dxa"/>
-            <w:tcBorders/>
-            <w:vAlign w:val="center"/>
-          </w:tcPr>
-          <w:p>
-            <w:pPr>
-              <w:pStyle w:val="Normal"/>
-              <w:widowControl/>
-              <w:spacing w:lineRule="auto" w:line="240" w:before="0" w:after="0"/>
-              <w:jc w:val="left"/>
-              <w:rPr>
-                <w:rFonts w:ascii="FreeSans" w:hAnsi="FreeSans" w:eastAsia="ＭＳ 明朝" w:cs=""/>
-                <w:kern w:val="0"/>
-                <w:sz w:val="20"/>
-                <w:szCs w:val="20"/>
-                <w:lang w:val="en-US" w:eastAsia="en-US" w:bidi="ar-SA"/>
-              </w:rPr>
-            </w:pPr>
-            <w:r>
-              <w:rPr>
-                <w:rFonts w:eastAsia="ＭＳ 明朝" w:cs="" w:ascii="FreeSans" w:hAnsi="FreeSans"/>
-                <w:kern w:val="0"/>
-                <w:sz w:val="20"/>
-                <w:szCs w:val="20"/>
-                <w:lang w:val="en-US" w:eastAsia="en-US" w:bidi="ar-SA"/>
-              </w:rPr>
+              <w:t>Аналогічно 4-5</w:t>
             </w:r>
           </w:p>
         </w:tc>
@@ -2109,6 +2243,7 @@
             <w:pPr>
               <w:pStyle w:val="Normal"/>
               <w:widowControl/>
+              <w:suppressAutoHyphens w:val="true"/>
               <w:spacing w:lineRule="auto" w:line="240" w:before="0" w:after="0"/>
               <w:jc w:val="left"/>
               <w:rPr>
@@ -2127,7 +2262,7 @@
                 <w:szCs w:val="20"/>
                 <w:lang w:val="en-US" w:eastAsia="en-US" w:bidi="ar-SA"/>
               </w:rPr>
-              <w:t>6</w:t>
+              <w:t>7</w:t>
             </w:r>
           </w:p>
         </w:tc>
@@ -2141,6 +2276,7 @@
             <w:pPr>
               <w:pStyle w:val="Normal"/>
               <w:widowControl/>
+              <w:suppressAutoHyphens w:val="true"/>
               <w:spacing w:lineRule="auto" w:line="240" w:before="0" w:after="0"/>
               <w:jc w:val="left"/>
               <w:rPr>
@@ -2159,7 +2295,7 @@
                 <w:szCs w:val="20"/>
                 <w:lang w:val="en-US" w:eastAsia="en-US" w:bidi="ar-SA"/>
               </w:rPr>
-              <w:t>Найгірша сесія</w:t>
+              <w:t>Найкращий день</w:t>
             </w:r>
           </w:p>
         </w:tc>
@@ -2175,6 +2311,7 @@
             <w:pPr>
               <w:pStyle w:val="Normal"/>
               <w:widowControl/>
+              <w:suppressAutoHyphens w:val="true"/>
               <w:spacing w:lineRule="auto" w:line="240" w:before="0" w:after="0"/>
               <w:jc w:val="left"/>
               <w:rPr>
@@ -2193,7 +2330,7 @@
                 <w:szCs w:val="20"/>
                 <w:lang w:val="en-US" w:eastAsia="en-US" w:bidi="ar-SA"/>
               </w:rPr>
-              <w:t>Завершення сесії</w:t>
+              <w:t>Перший запуск наступного дня</w:t>
             </w:r>
           </w:p>
         </w:tc>
@@ -2209,6 +2346,7 @@
             <w:pPr>
               <w:pStyle w:val="Normal"/>
               <w:widowControl/>
+              <w:suppressAutoHyphens w:val="true"/>
               <w:spacing w:lineRule="auto" w:line="240" w:before="0" w:after="0"/>
               <w:jc w:val="left"/>
               <w:rPr>
@@ -2227,6 +2365,17 @@
                 <w:szCs w:val="20"/>
                 <w:lang w:val="en-US" w:eastAsia="en-US" w:bidi="ar-SA"/>
               </w:rPr>
+              <w:t xml:space="preserve">Surprisal </w:t>
+            </w:r>
+            <w:r>
+              <w:rPr>
+                <w:rFonts w:eastAsia="ＭＳ 明朝" w:cs="" w:ascii="FreeSans" w:hAnsi="FreeSans"/>
+                <w:kern w:val="0"/>
+                <w:sz w:val="20"/>
+                <w:szCs w:val="20"/>
+                <w:lang w:val="en-US" w:eastAsia="en-US" w:bidi="ar-SA"/>
+              </w:rPr>
+              <w:t>дня</w:t>
             </w:r>
           </w:p>
         </w:tc>
@@ -2240,6 +2389,7 @@
             <w:pPr>
               <w:pStyle w:val="Normal"/>
               <w:widowControl/>
+              <w:suppressAutoHyphens w:val="true"/>
               <w:spacing w:lineRule="auto" w:line="240" w:before="0" w:after="0"/>
               <w:jc w:val="left"/>
               <w:rPr>
@@ -2271,6 +2421,7 @@
             <w:pPr>
               <w:pStyle w:val="Normal"/>
               <w:widowControl/>
+              <w:suppressAutoHyphens w:val="true"/>
               <w:spacing w:lineRule="auto" w:line="240" w:before="0" w:after="0"/>
               <w:jc w:val="left"/>
               <w:rPr>
@@ -2289,13 +2440,13 @@
                 <w:szCs w:val="20"/>
                 <w:lang w:val="en-US" w:eastAsia="en-US" w:bidi="ar-SA"/>
               </w:rPr>
-              <w:t>Мінімальна щільність сесії</w:t>
+              <w:t xml:space="preserve">Перший запуск додатку протягом доби – розрахувати подобово Surprisal </w:t>
             </w:r>
           </w:p>
         </w:tc>
         <w:tc>
           <w:tcPr>
-            <w:tcW w:w="893" w:type="dxa"/>
+            <w:tcW w:w="892" w:type="dxa"/>
             <w:tcBorders/>
             <w:vAlign w:val="center"/>
           </w:tcPr>
@@ -2303,6 +2454,7 @@
             <w:pPr>
               <w:pStyle w:val="Normal"/>
               <w:widowControl/>
+              <w:suppressAutoHyphens w:val="true"/>
               <w:spacing w:lineRule="auto" w:line="240" w:before="0" w:after="0"/>
               <w:jc w:val="left"/>
               <w:rPr>
@@ -2314,14 +2466,7 @@
               </w:rPr>
             </w:pPr>
             <w:r>
-              <w:rPr>
-                <w:rFonts w:eastAsia="ＭＳ 明朝" w:cs="" w:ascii="FreeSans" w:hAnsi="FreeSans"/>
-                <w:kern w:val="0"/>
-                <w:sz w:val="20"/>
-                <w:szCs w:val="20"/>
-                <w:lang w:val="en-US" w:eastAsia="en-US" w:bidi="ar-SA"/>
-              </w:rPr>
-              <w:t>Найнижче значення щільності серед сесій, що перевищують noiseLevel.</w:t>
+              <w:rPr/>
             </w:r>
           </w:p>
         </w:tc>
@@ -2338,235 +2483,7 @@
             <w:pPr>
               <w:pStyle w:val="Normal"/>
               <w:widowControl/>
-              <w:spacing w:lineRule="auto" w:line="240" w:before="0" w:after="0"/>
-              <w:jc w:val="left"/>
-              <w:rPr>
-                <w:rFonts w:ascii="FreeSans" w:hAnsi="FreeSans" w:eastAsia="ＭＳ 明朝" w:cs=""/>
-                <w:kern w:val="0"/>
-                <w:sz w:val="20"/>
-                <w:szCs w:val="20"/>
-                <w:lang w:val="en-US" w:eastAsia="en-US" w:bidi="ar-SA"/>
-              </w:rPr>
-            </w:pPr>
-            <w:r>
-              <w:rPr>
-                <w:rFonts w:eastAsia="ＭＳ 明朝" w:cs="" w:ascii="FreeSans" w:hAnsi="FreeSans"/>
-                <w:kern w:val="0"/>
-                <w:sz w:val="20"/>
-                <w:szCs w:val="20"/>
-                <w:lang w:val="en-US" w:eastAsia="en-US" w:bidi="ar-SA"/>
-              </w:rPr>
-              <w:t>7</w:t>
-            </w:r>
-          </w:p>
-        </w:tc>
-        <w:tc>
-          <w:tcPr>
-            <w:tcW w:w="1861" w:type="dxa"/>
-            <w:tcBorders/>
-            <w:vAlign w:val="center"/>
-          </w:tcPr>
-          <w:p>
-            <w:pPr>
-              <w:pStyle w:val="Normal"/>
-              <w:widowControl/>
-              <w:spacing w:lineRule="auto" w:line="240" w:before="0" w:after="0"/>
-              <w:jc w:val="left"/>
-              <w:rPr>
-                <w:rFonts w:ascii="FreeSans" w:hAnsi="FreeSans" w:eastAsia="ＭＳ 明朝" w:cs=""/>
-                <w:kern w:val="0"/>
-                <w:sz w:val="20"/>
-                <w:szCs w:val="20"/>
-                <w:lang w:val="en-US" w:eastAsia="en-US" w:bidi="ar-SA"/>
-              </w:rPr>
-            </w:pPr>
-            <w:r>
-              <w:rPr>
-                <w:rFonts w:eastAsia="ＭＳ 明朝" w:cs="" w:ascii="FreeSans" w:hAnsi="FreeSans"/>
-                <w:kern w:val="0"/>
-                <w:sz w:val="20"/>
-                <w:szCs w:val="20"/>
-                <w:lang w:val="en-US" w:eastAsia="en-US" w:bidi="ar-SA"/>
-              </w:rPr>
-              <w:t>Найкращий день</w:t>
-            </w:r>
-          </w:p>
-        </w:tc>
-        <w:tc>
-          <w:tcPr>
-            <w:tcW w:w="1697" w:type="dxa"/>
-            <w:tcBorders>
-              <w:right w:val="nil"/>
-            </w:tcBorders>
-            <w:vAlign w:val="center"/>
-          </w:tcPr>
-          <w:p>
-            <w:pPr>
-              <w:pStyle w:val="Normal"/>
-              <w:widowControl/>
-              <w:spacing w:lineRule="auto" w:line="240" w:before="0" w:after="0"/>
-              <w:jc w:val="left"/>
-              <w:rPr>
-                <w:rFonts w:ascii="FreeSans" w:hAnsi="FreeSans" w:eastAsia="ＭＳ 明朝" w:cs=""/>
-                <w:kern w:val="0"/>
-                <w:sz w:val="20"/>
-                <w:szCs w:val="20"/>
-                <w:lang w:val="en-US" w:eastAsia="en-US" w:bidi="ar-SA"/>
-              </w:rPr>
-            </w:pPr>
-            <w:r>
-              <w:rPr>
-                <w:rFonts w:eastAsia="ＭＳ 明朝" w:cs="" w:ascii="FreeSans" w:hAnsi="FreeSans"/>
-                <w:kern w:val="0"/>
-                <w:sz w:val="20"/>
-                <w:szCs w:val="20"/>
-                <w:lang w:val="en-US" w:eastAsia="en-US" w:bidi="ar-SA"/>
-              </w:rPr>
-              <w:t>Завершення сесії</w:t>
-            </w:r>
-          </w:p>
-        </w:tc>
-        <w:tc>
-          <w:tcPr>
-            <w:tcW w:w="1473" w:type="dxa"/>
-            <w:tcBorders>
-              <w:right w:val="nil"/>
-            </w:tcBorders>
-            <w:vAlign w:val="center"/>
-          </w:tcPr>
-          <w:p>
-            <w:pPr>
-              <w:pStyle w:val="Normal"/>
-              <w:widowControl/>
-              <w:spacing w:lineRule="auto" w:line="240" w:before="0" w:after="0"/>
-              <w:jc w:val="left"/>
-              <w:rPr>
-                <w:rFonts w:ascii="FreeSans" w:hAnsi="FreeSans" w:eastAsia="ＭＳ 明朝" w:cs=""/>
-                <w:kern w:val="0"/>
-                <w:sz w:val="20"/>
-                <w:szCs w:val="20"/>
-                <w:lang w:val="en-US" w:eastAsia="en-US" w:bidi="ar-SA"/>
-              </w:rPr>
-            </w:pPr>
-            <w:r>
-              <w:rPr>
-                <w:rFonts w:eastAsia="ＭＳ 明朝" w:cs="" w:ascii="FreeSans" w:hAnsi="FreeSans"/>
-                <w:kern w:val="0"/>
-                <w:sz w:val="20"/>
-                <w:szCs w:val="20"/>
-                <w:lang w:val="en-US" w:eastAsia="en-US" w:bidi="ar-SA"/>
-              </w:rPr>
-            </w:r>
-          </w:p>
-        </w:tc>
-        <w:tc>
-          <w:tcPr>
-            <w:tcW w:w="1705" w:type="dxa"/>
-            <w:tcBorders/>
-            <w:vAlign w:val="center"/>
-          </w:tcPr>
-          <w:p>
-            <w:pPr>
-              <w:pStyle w:val="Normal"/>
-              <w:widowControl/>
-              <w:spacing w:lineRule="auto" w:line="240" w:before="0" w:after="0"/>
-              <w:jc w:val="left"/>
-              <w:rPr>
-                <w:rFonts w:ascii="FreeSans" w:hAnsi="FreeSans" w:eastAsia="ＭＳ 明朝" w:cs=""/>
-                <w:kern w:val="0"/>
-                <w:sz w:val="20"/>
-                <w:szCs w:val="20"/>
-                <w:lang w:val="en-US" w:eastAsia="en-US" w:bidi="ar-SA"/>
-              </w:rPr>
-            </w:pPr>
-            <w:r>
-              <w:rPr>
-                <w:rFonts w:eastAsia="ＭＳ 明朝" w:cs="" w:ascii="FreeSans" w:hAnsi="FreeSans"/>
-                <w:kern w:val="0"/>
-                <w:sz w:val="20"/>
-                <w:szCs w:val="20"/>
-                <w:lang w:val="en-US" w:eastAsia="en-US" w:bidi="ar-SA"/>
-              </w:rPr>
-            </w:r>
-          </w:p>
-        </w:tc>
-        <w:tc>
-          <w:tcPr>
-            <w:tcW w:w="4983" w:type="dxa"/>
-            <w:tcBorders/>
-            <w:vAlign w:val="center"/>
-          </w:tcPr>
-          <w:p>
-            <w:pPr>
-              <w:pStyle w:val="Normal"/>
-              <w:widowControl/>
-              <w:spacing w:lineRule="auto" w:line="240" w:before="0" w:after="0"/>
-              <w:jc w:val="left"/>
-              <w:rPr>
-                <w:rFonts w:ascii="FreeSans" w:hAnsi="FreeSans" w:eastAsia="ＭＳ 明朝" w:cs=""/>
-                <w:kern w:val="0"/>
-                <w:sz w:val="20"/>
-                <w:szCs w:val="20"/>
-                <w:lang w:val="en-US" w:eastAsia="en-US" w:bidi="ar-SA"/>
-              </w:rPr>
-            </w:pPr>
-            <w:r>
-              <w:rPr>
-                <w:rFonts w:eastAsia="ＭＳ 明朝" w:cs="" w:ascii="FreeSans" w:hAnsi="FreeSans"/>
-                <w:kern w:val="0"/>
-                <w:sz w:val="20"/>
-                <w:szCs w:val="20"/>
-                <w:lang w:val="en-US" w:eastAsia="en-US" w:bidi="ar-SA"/>
-              </w:rPr>
-              <w:t>Максимальна середня щільність сесій за день</w:t>
-            </w:r>
-          </w:p>
-        </w:tc>
-        <w:tc>
-          <w:tcPr>
-            <w:tcW w:w="893" w:type="dxa"/>
-            <w:tcBorders/>
-            <w:vAlign w:val="center"/>
-          </w:tcPr>
-          <w:p>
-            <w:pPr>
-              <w:pStyle w:val="Normal"/>
-              <w:widowControl/>
-              <w:spacing w:lineRule="auto" w:line="240" w:before="0" w:after="0"/>
-              <w:jc w:val="left"/>
-              <w:rPr>
-                <w:rFonts w:ascii="FreeSans" w:hAnsi="FreeSans" w:eastAsia="ＭＳ 明朝" w:cs=""/>
-                <w:kern w:val="0"/>
-                <w:sz w:val="20"/>
-                <w:szCs w:val="20"/>
-                <w:lang w:val="en-US" w:eastAsia="en-US" w:bidi="ar-SA"/>
-              </w:rPr>
-            </w:pPr>
-            <w:r>
-              <w:rPr>
-                <w:rFonts w:eastAsia="ＭＳ 明朝" w:cs="" w:ascii="FreeSans" w:hAnsi="FreeSans"/>
-                <w:kern w:val="0"/>
-                <w:sz w:val="20"/>
-                <w:szCs w:val="20"/>
-                <w:lang w:val="en-US" w:eastAsia="en-US" w:bidi="ar-SA"/>
-              </w:rPr>
-              <w:t>Середнє значення щільності всіх сесій за один календарний день; враховуються сесії, що перевищують noiseLevel.</w:t>
-            </w:r>
-          </w:p>
-        </w:tc>
-      </w:tr>
-      <w:tr>
-        <w:trPr/>
-        <w:tc>
-          <w:tcPr>
-            <w:tcW w:w="460" w:type="dxa"/>
-            <w:tcBorders/>
-            <w:vAlign w:val="center"/>
-          </w:tcPr>
-          <w:p>
-            <w:pPr>
-              <w:pStyle w:val="Normal"/>
-              <w:widowControl/>
+              <w:suppressAutoHyphens w:val="true"/>
               <w:spacing w:lineRule="auto" w:line="240" w:before="0" w:after="0"/>
               <w:jc w:val="left"/>
               <w:rPr>
@@ -2599,6 +2516,7 @@
             <w:pPr>
               <w:pStyle w:val="Normal"/>
               <w:widowControl/>
+              <w:suppressAutoHyphens w:val="true"/>
               <w:spacing w:lineRule="auto" w:line="240" w:before="0" w:after="0"/>
               <w:jc w:val="left"/>
               <w:rPr>
@@ -2633,6 +2551,7 @@
             <w:pPr>
               <w:pStyle w:val="Normal"/>
               <w:widowControl/>
+              <w:suppressAutoHyphens w:val="true"/>
               <w:spacing w:lineRule="auto" w:line="240" w:before="0" w:after="0"/>
               <w:jc w:val="left"/>
               <w:rPr>
@@ -2644,14 +2563,7 @@
               </w:rPr>
             </w:pPr>
             <w:r>
-              <w:rPr>
-                <w:rFonts w:eastAsia="ＭＳ 明朝" w:cs="" w:ascii="FreeSans" w:hAnsi="FreeSans"/>
-                <w:kern w:val="0"/>
-                <w:sz w:val="20"/>
-                <w:szCs w:val="20"/>
-                <w:lang w:val="en-US" w:eastAsia="en-US" w:bidi="ar-SA"/>
-              </w:rPr>
-              <w:t>Завершення сесії</w:t>
+              <w:rPr/>
             </w:r>
           </w:p>
         </w:tc>
@@ -2667,6 +2579,7 @@
             <w:pPr>
               <w:pStyle w:val="Normal"/>
               <w:widowControl/>
+              <w:suppressAutoHyphens w:val="true"/>
               <w:spacing w:lineRule="auto" w:line="240" w:before="0" w:after="0"/>
               <w:jc w:val="left"/>
               <w:rPr>
@@ -2698,6 +2611,7 @@
             <w:pPr>
               <w:pStyle w:val="Normal"/>
               <w:widowControl/>
+              <w:suppressAutoHyphens w:val="true"/>
               <w:spacing w:lineRule="auto" w:line="240" w:before="0" w:after="0"/>
               <w:jc w:val="left"/>
               <w:rPr>
@@ -2729,6 +2643,7 @@
             <w:pPr>
               <w:pStyle w:val="Normal"/>
               <w:widowControl/>
+              <w:suppressAutoHyphens w:val="true"/>
               <w:spacing w:lineRule="auto" w:line="240" w:before="0" w:after="0"/>
               <w:jc w:val="left"/>
               <w:rPr>
@@ -2753,7 +2668,7 @@
         </w:tc>
         <w:tc>
           <w:tcPr>
-            <w:tcW w:w="893" w:type="dxa"/>
+            <w:tcW w:w="892" w:type="dxa"/>
             <w:tcBorders/>
             <w:vAlign w:val="center"/>
           </w:tcPr>
@@ -2761,6 +2676,7 @@
             <w:pPr>
               <w:pStyle w:val="Normal"/>
               <w:widowControl/>
+              <w:suppressAutoHyphens w:val="true"/>
               <w:spacing w:lineRule="auto" w:line="240" w:before="0" w:after="0"/>
               <w:jc w:val="left"/>
               <w:rPr>
@@ -2772,14 +2688,7 @@
               </w:rPr>
             </w:pPr>
             <w:r>
-              <w:rPr>
-                <w:rFonts w:eastAsia="ＭＳ 明朝" w:cs="" w:ascii="FreeSans" w:hAnsi="FreeSans"/>
-                <w:kern w:val="0"/>
-                <w:sz w:val="20"/>
-                <w:szCs w:val="20"/>
-                <w:lang w:val="en-US" w:eastAsia="en-US" w:bidi="ar-SA"/>
-              </w:rPr>
-              <w:t>Середнє значення щільності всіх сесій за один календарний день; враховуються сесії, що перевищують noiseLevel.</w:t>
+              <w:rPr/>
             </w:r>
           </w:p>
         </w:tc>
@@ -2852,6 +2761,7 @@
             <w:pPr>
               <w:pStyle w:val="Normal"/>
               <w:widowControl/>
+              <w:suppressAutoHyphens w:val="true"/>
               <w:spacing w:lineRule="auto" w:line="240" w:before="0" w:after="0"/>
               <w:jc w:val="left"/>
               <w:rPr>
@@ -2884,6 +2794,7 @@
             <w:pPr>
               <w:pStyle w:val="Normal"/>
               <w:widowControl/>
+              <w:suppressAutoHyphens w:val="true"/>
               <w:spacing w:lineRule="auto" w:line="240" w:before="0" w:after="0"/>
               <w:jc w:val="left"/>
               <w:rPr>
@@ -2916,6 +2827,7 @@
             <w:pPr>
               <w:pStyle w:val="Normal"/>
               <w:widowControl/>
+              <w:suppressAutoHyphens w:val="true"/>
               <w:spacing w:lineRule="auto" w:line="240" w:before="0" w:after="0"/>
               <w:jc w:val="left"/>
               <w:rPr>
@@ -2951,6 +2863,7 @@
             <w:pPr>
               <w:pStyle w:val="Normal"/>
               <w:widowControl/>
+              <w:suppressAutoHyphens w:val="true"/>
               <w:spacing w:lineRule="auto" w:line="240" w:before="0" w:after="0"/>
               <w:jc w:val="left"/>
               <w:rPr>
@@ -2982,6 +2895,7 @@
             <w:pPr>
               <w:pStyle w:val="Normal"/>
               <w:widowControl/>
+              <w:suppressAutoHyphens w:val="true"/>
               <w:spacing w:lineRule="auto" w:line="240" w:before="0" w:after="0"/>
               <w:jc w:val="left"/>
               <w:rPr>
@@ -3013,6 +2927,7 @@
             <w:pPr>
               <w:pStyle w:val="Normal"/>
               <w:widowControl/>
+              <w:suppressAutoHyphens w:val="true"/>
               <w:spacing w:lineRule="auto" w:line="240" w:before="0" w:after="0"/>
               <w:jc w:val="left"/>
               <w:rPr>
@@ -3047,6 +2962,7 @@
             <w:pPr>
               <w:pStyle w:val="Normal"/>
               <w:widowControl/>
+              <w:suppressAutoHyphens w:val="true"/>
               <w:spacing w:lineRule="auto" w:line="240" w:before="0" w:after="0"/>
               <w:jc w:val="left"/>
               <w:rPr>
@@ -3078,6 +2994,7 @@
             <w:pPr>
               <w:pStyle w:val="Normal"/>
               <w:widowControl/>
+              <w:suppressAutoHyphens w:val="true"/>
               <w:spacing w:lineRule="auto" w:line="240" w:before="0" w:after="0"/>
               <w:jc w:val="left"/>
               <w:rPr>
@@ -3109,6 +3026,7 @@
             <w:pPr>
               <w:pStyle w:val="Normal"/>
               <w:widowControl/>
+              <w:suppressAutoHyphens w:val="true"/>
               <w:spacing w:lineRule="auto" w:line="240" w:before="0" w:after="0"/>
               <w:jc w:val="left"/>
               <w:rPr>
@@ -3143,6 +3061,7 @@
             <w:pPr>
               <w:pStyle w:val="Normal"/>
               <w:widowControl/>
+              <w:suppressAutoHyphens w:val="true"/>
               <w:spacing w:lineRule="auto" w:line="240" w:before="0" w:after="0"/>
               <w:jc w:val="left"/>
               <w:rPr>
@@ -3174,6 +3093,7 @@
             <w:pPr>
               <w:pStyle w:val="Normal"/>
               <w:widowControl/>
+              <w:suppressAutoHyphens w:val="true"/>
               <w:spacing w:lineRule="auto" w:line="240" w:before="0" w:after="0"/>
               <w:jc w:val="left"/>
               <w:rPr>
@@ -3205,6 +3125,7 @@
             <w:pPr>
               <w:pStyle w:val="Normal"/>
               <w:widowControl/>
+              <w:suppressAutoHyphens w:val="true"/>
               <w:spacing w:lineRule="auto" w:line="240" w:before="0" w:after="0"/>
               <w:jc w:val="left"/>
               <w:rPr>
@@ -3239,6 +3160,7 @@
             <w:pPr>
               <w:pStyle w:val="Normal"/>
               <w:widowControl/>
+              <w:suppressAutoHyphens w:val="true"/>
               <w:spacing w:lineRule="auto" w:line="240" w:before="0" w:after="0"/>
               <w:jc w:val="left"/>
               <w:rPr>
@@ -3270,6 +3192,7 @@
             <w:pPr>
               <w:pStyle w:val="Normal"/>
               <w:widowControl/>
+              <w:suppressAutoHyphens w:val="true"/>
               <w:spacing w:lineRule="auto" w:line="240" w:before="0" w:after="0"/>
               <w:jc w:val="left"/>
               <w:rPr>
@@ -3301,6 +3224,7 @@
             <w:pPr>
               <w:pStyle w:val="Normal"/>
               <w:widowControl/>
+              <w:suppressAutoHyphens w:val="true"/>
               <w:spacing w:lineRule="auto" w:line="240" w:before="0" w:after="0"/>
               <w:jc w:val="left"/>
               <w:rPr>
@@ -3520,6 +3444,7 @@
         </w:tabs>
         <w:ind w:left="1080" w:hanging="360"/>
       </w:pPr>
+      <w:rPr/>
     </w:lvl>
     <w:lvl w:ilvl="2">
       <w:start w:val="1"/>
@@ -3532,6 +3457,7 @@
         </w:tabs>
         <w:ind w:left="1440" w:hanging="360"/>
       </w:pPr>
+      <w:rPr/>
     </w:lvl>
     <w:lvl w:ilvl="3">
       <w:start w:val="1"/>
@@ -3544,6 +3470,7 @@
         </w:tabs>
         <w:ind w:left="1800" w:hanging="360"/>
       </w:pPr>
+      <w:rPr/>
     </w:lvl>
     <w:lvl w:ilvl="4">
       <w:start w:val="1"/>
@@ -3556,6 +3483,7 @@
         </w:tabs>
         <w:ind w:left="2160" w:hanging="360"/>
       </w:pPr>
+      <w:rPr/>
     </w:lvl>
     <w:lvl w:ilvl="5">
       <w:start w:val="1"/>
@@ -3568,6 +3496,7 @@
         </w:tabs>
         <w:ind w:left="2520" w:hanging="360"/>
       </w:pPr>
+      <w:rPr/>
     </w:lvl>
     <w:lvl w:ilvl="6">
       <w:start w:val="1"/>
@@ -3580,6 +3509,7 @@
         </w:tabs>
         <w:ind w:left="2880" w:hanging="360"/>
       </w:pPr>
+      <w:rPr/>
     </w:lvl>
     <w:lvl w:ilvl="7">
       <w:start w:val="1"/>
@@ -3592,6 +3522,7 @@
         </w:tabs>
         <w:ind w:left="3240" w:hanging="360"/>
       </w:pPr>
+      <w:rPr/>
     </w:lvl>
     <w:lvl w:ilvl="8">
       <w:start w:val="1"/>
@@ -3604,6 +3535,7 @@
         </w:tabs>
         <w:ind w:left="3600" w:hanging="360"/>
       </w:pPr>
+      <w:rPr/>
     </w:lvl>
   </w:abstractNum>
   <w:abstractNum w:abstractNumId="2">
@@ -3633,6 +3565,7 @@
         </w:tabs>
         <w:ind w:left="1080" w:hanging="360"/>
       </w:pPr>
+      <w:rPr/>
     </w:lvl>
     <w:lvl w:ilvl="2">
       <w:start w:val="1"/>
@@ -3645,6 +3578,7 @@
         </w:tabs>
         <w:ind w:left="1440" w:hanging="360"/>
       </w:pPr>
+      <w:rPr/>
     </w:lvl>
     <w:lvl w:ilvl="3">
       <w:start w:val="1"/>
@@ -3657,6 +3591,7 @@
         </w:tabs>
         <w:ind w:left="1800" w:hanging="360"/>
       </w:pPr>
+      <w:rPr/>
     </w:lvl>
     <w:lvl w:ilvl="4">
       <w:start w:val="1"/>
@@ -3669,6 +3604,7 @@
         </w:tabs>
         <w:ind w:left="2160" w:hanging="360"/>
       </w:pPr>
+      <w:rPr/>
     </w:lvl>
     <w:lvl w:ilvl="5">
       <w:start w:val="1"/>
@@ -3681,6 +3617,7 @@
         </w:tabs>
         <w:ind w:left="2520" w:hanging="360"/>
       </w:pPr>
+      <w:rPr/>
     </w:lvl>
     <w:lvl w:ilvl="6">
       <w:start w:val="1"/>
@@ -3693,6 +3630,7 @@
         </w:tabs>
         <w:ind w:left="2880" w:hanging="360"/>
       </w:pPr>
+      <w:rPr/>
     </w:lvl>
     <w:lvl w:ilvl="7">
       <w:start w:val="1"/>
@@ -3705,6 +3643,7 @@
         </w:tabs>
         <w:ind w:left="3240" w:hanging="360"/>
       </w:pPr>
+      <w:rPr/>
     </w:lvl>
     <w:lvl w:ilvl="8">
       <w:start w:val="1"/>
@@ -3717,6 +3656,7 @@
         </w:tabs>
         <w:ind w:left="3600" w:hanging="360"/>
       </w:pPr>
+      <w:rPr/>
     </w:lvl>
   </w:abstractNum>
   <w:abstractNum w:abstractNumId="3">
@@ -3746,6 +3686,7 @@
         </w:tabs>
         <w:ind w:left="1080" w:hanging="360"/>
       </w:pPr>
+      <w:rPr/>
     </w:lvl>
     <w:lvl w:ilvl="2">
       <w:start w:val="1"/>
@@ -3758,6 +3699,7 @@
         </w:tabs>
         <w:ind w:left="1440" w:hanging="360"/>
       </w:pPr>
+      <w:rPr/>
     </w:lvl>
     <w:lvl w:ilvl="3">
       <w:start w:val="1"/>
@@ -3770,6 +3712,7 @@
         </w:tabs>
         <w:ind w:left="1800" w:hanging="360"/>
       </w:pPr>
+      <w:rPr/>
     </w:lvl>
     <w:lvl w:ilvl="4">
       <w:start w:val="1"/>
@@ -3782,6 +3725,7 @@
         </w:tabs>
         <w:ind w:left="2160" w:hanging="360"/>
       </w:pPr>
+      <w:rPr/>
     </w:lvl>
     <w:lvl w:ilvl="5">
       <w:start w:val="1"/>
@@ -3794,6 +3738,7 @@
         </w:tabs>
         <w:ind w:left="2520" w:hanging="360"/>
       </w:pPr>
+      <w:rPr/>
     </w:lvl>
     <w:lvl w:ilvl="6">
       <w:start w:val="1"/>
@@ -3806,6 +3751,7 @@
         </w:tabs>
         <w:ind w:left="2880" w:hanging="360"/>
       </w:pPr>
+      <w:rPr/>
     </w:lvl>
     <w:lvl w:ilvl="7">
       <w:start w:val="1"/>
@@ -3818,6 +3764,7 @@
         </w:tabs>
         <w:ind w:left="3240" w:hanging="360"/>
       </w:pPr>
+      <w:rPr/>
     </w:lvl>
     <w:lvl w:ilvl="8">
       <w:start w:val="1"/>
@@ -3830,6 +3777,7 @@
         </w:tabs>
         <w:ind w:left="3600" w:hanging="360"/>
       </w:pPr>
+      <w:rPr/>
     </w:lvl>
   </w:abstractNum>
   <w:abstractNum w:abstractNumId="4">
@@ -3857,6 +3805,7 @@
         </w:tabs>
         <w:ind w:left="1080" w:hanging="360"/>
       </w:pPr>
+      <w:rPr/>
     </w:lvl>
     <w:lvl w:ilvl="2">
       <w:start w:val="1"/>
@@ -3869,6 +3818,7 @@
         </w:tabs>
         <w:ind w:left="1440" w:hanging="360"/>
       </w:pPr>
+      <w:rPr/>
     </w:lvl>
     <w:lvl w:ilvl="3">
       <w:start w:val="1"/>
@@ -3881,6 +3831,7 @@
         </w:tabs>
         <w:ind w:left="1800" w:hanging="360"/>
       </w:pPr>
+      <w:rPr/>
     </w:lvl>
     <w:lvl w:ilvl="4">
       <w:start w:val="1"/>
@@ -3893,6 +3844,7 @@
         </w:tabs>
         <w:ind w:left="2160" w:hanging="360"/>
       </w:pPr>
+      <w:rPr/>
     </w:lvl>
     <w:lvl w:ilvl="5">
       <w:start w:val="1"/>
@@ -3905,6 +3857,7 @@
         </w:tabs>
         <w:ind w:left="2520" w:hanging="360"/>
       </w:pPr>
+      <w:rPr/>
     </w:lvl>
     <w:lvl w:ilvl="6">
       <w:start w:val="1"/>
@@ -3917,6 +3870,7 @@
         </w:tabs>
         <w:ind w:left="2880" w:hanging="360"/>
       </w:pPr>
+      <w:rPr/>
     </w:lvl>
     <w:lvl w:ilvl="7">
       <w:start w:val="1"/>
@@ -3929,6 +3883,7 @@
         </w:tabs>
         <w:ind w:left="3240" w:hanging="360"/>
       </w:pPr>
+      <w:rPr/>
     </w:lvl>
     <w:lvl w:ilvl="8">
       <w:start w:val="1"/>
@@ -3941,6 +3896,7 @@
         </w:tabs>
         <w:ind w:left="3600" w:hanging="360"/>
       </w:pPr>
+      <w:rPr/>
     </w:lvl>
   </w:abstractNum>
   <w:abstractNum w:abstractNumId="5">
@@ -3968,6 +3924,7 @@
         </w:tabs>
         <w:ind w:left="1080" w:hanging="360"/>
       </w:pPr>
+      <w:rPr/>
     </w:lvl>
     <w:lvl w:ilvl="2">
       <w:start w:val="1"/>
@@ -3980,6 +3937,7 @@
         </w:tabs>
         <w:ind w:left="1440" w:hanging="360"/>
       </w:pPr>
+      <w:rPr/>
     </w:lvl>
     <w:lvl w:ilvl="3">
       <w:start w:val="1"/>
@@ -3992,6 +3950,7 @@
         </w:tabs>
         <w:ind w:left="1800" w:hanging="360"/>
       </w:pPr>
+      <w:rPr/>
     </w:lvl>
     <w:lvl w:ilvl="4">
       <w:start w:val="1"/>
@@ -4004,6 +3963,7 @@
         </w:tabs>
         <w:ind w:left="2160" w:hanging="360"/>
       </w:pPr>
+      <w:rPr/>
     </w:lvl>
     <w:lvl w:ilvl="5">
       <w:start w:val="1"/>
@@ -4016,6 +3976,7 @@
         </w:tabs>
         <w:ind w:left="2520" w:hanging="360"/>
       </w:pPr>
+      <w:rPr/>
     </w:lvl>
     <w:lvl w:ilvl="6">
       <w:start w:val="1"/>
@@ -4028,6 +3989,7 @@
         </w:tabs>
         <w:ind w:left="2880" w:hanging="360"/>
       </w:pPr>
+      <w:rPr/>
     </w:lvl>
     <w:lvl w:ilvl="7">
       <w:start w:val="1"/>
@@ -4040,6 +4002,7 @@
         </w:tabs>
         <w:ind w:left="3240" w:hanging="360"/>
       </w:pPr>
+      <w:rPr/>
     </w:lvl>
     <w:lvl w:ilvl="8">
       <w:start w:val="1"/>
@@ -4052,6 +4015,7 @@
         </w:tabs>
         <w:ind w:left="3600" w:hanging="360"/>
       </w:pPr>
+      <w:rPr/>
     </w:lvl>
   </w:abstractNum>
   <w:abstractNum w:abstractNumId="6">
@@ -4079,6 +4043,7 @@
         </w:tabs>
         <w:ind w:left="1080" w:hanging="360"/>
       </w:pPr>
+      <w:rPr/>
     </w:lvl>
     <w:lvl w:ilvl="2">
       <w:start w:val="1"/>
@@ -4091,6 +4056,7 @@
         </w:tabs>
         <w:ind w:left="1440" w:hanging="360"/>
       </w:pPr>
+      <w:rPr/>
     </w:lvl>
     <w:lvl w:ilvl="3">
       <w:start w:val="1"/>
@@ -4103,6 +4069,7 @@
         </w:tabs>
         <w:ind w:left="1800" w:hanging="360"/>
       </w:pPr>
+      <w:rPr/>
     </w:lvl>
     <w:lvl w:ilvl="4">
       <w:start w:val="1"/>
@@ -4115,6 +4082,7 @@
         </w:tabs>
         <w:ind w:left="2160" w:hanging="360"/>
       </w:pPr>
+      <w:rPr/>
     </w:lvl>
     <w:lvl w:ilvl="5">
       <w:start w:val="1"/>
@@ -4127,6 +4095,7 @@
         </w:tabs>
         <w:ind w:left="2520" w:hanging="360"/>
       </w:pPr>
+      <w:rPr/>
     </w:lvl>
     <w:lvl w:ilvl="6">
       <w:start w:val="1"/>
@@ -4139,6 +4108,7 @@
         </w:tabs>
         <w:ind w:left="2880" w:hanging="360"/>
       </w:pPr>
+      <w:rPr/>
     </w:lvl>
     <w:lvl w:ilvl="7">
       <w:start w:val="1"/>
@@ -4151,6 +4121,7 @@
         </w:tabs>
         <w:ind w:left="3240" w:hanging="360"/>
       </w:pPr>
+      <w:rPr/>
     </w:lvl>
     <w:lvl w:ilvl="8">
       <w:start w:val="1"/>
@@ -4163,6 +4134,7 @@
         </w:tabs>
         <w:ind w:left="3600" w:hanging="360"/>
       </w:pPr>
+      <w:rPr/>
     </w:lvl>
   </w:abstractNum>
   <w:abstractNum w:abstractNumId="7">
@@ -4313,7 +4285,7 @@
   <w:docDefaults>
     <w:rPrDefault>
       <w:rPr>
-        <w:rFonts w:ascii="Cambria" w:hAnsi="Cambria" w:eastAsia="ＭＳ 明朝" w:cs="" w:asciiTheme="minorHAnsi" w:cstheme="minorBidi" w:eastAsiaTheme="minorEastAsia" w:hAnsiTheme="minorHAnsi"/>
+        <w:rFonts w:ascii="Cambria" w:hAnsi="Cambria" w:eastAsia="" w:cs="" w:asciiTheme="minorHAnsi" w:cstheme="minorBidi" w:eastAsiaTheme="minorEastAsia" w:hAnsiTheme="minorHAnsi"/>
         <w:sz w:val="22"/>
         <w:szCs w:val="22"/>
         <w:lang w:val="en-US" w:eastAsia="en-US" w:bidi="ar-SA"/>
@@ -4470,12 +4442,13 @@
     <w:rsid w:val="00fc693f"/>
     <w:pPr>
       <w:widowControl/>
+      <w:suppressAutoHyphens w:val="true"/>
       <w:bidi w:val="0"/>
       <w:spacing w:lineRule="auto" w:line="276" w:before="0" w:after="200"/>
       <w:jc w:val="left"/>
     </w:pPr>
     <w:rPr>
-      <w:rFonts w:ascii="Aptos" w:hAnsi="Aptos" w:eastAsia="ＭＳ 明朝" w:cs="" w:cstheme="minorBidi" w:eastAsiaTheme="minorEastAsia"/>
+      <w:rFonts w:ascii="Aptos" w:hAnsi="Aptos" w:eastAsia="" w:cs="" w:cstheme="minorBidi" w:eastAsiaTheme="minorEastAsia"/>
       <w:color w:val="auto"/>
       <w:kern w:val="0"/>
       <w:sz w:val="21"/>
@@ -4498,7 +4471,7 @@
       <w:outlineLvl w:val="0"/>
     </w:pPr>
     <w:rPr>
-      <w:rFonts w:ascii="Calibri" w:hAnsi="Calibri" w:eastAsia="ＭＳ ゴシック" w:cs="" w:asciiTheme="majorHAnsi" w:cstheme="majorBidi" w:eastAsiaTheme="majorEastAsia" w:hAnsiTheme="majorHAnsi"/>
+      <w:rFonts w:ascii="Calibri" w:hAnsi="Calibri" w:eastAsia="" w:cs="" w:asciiTheme="majorHAnsi" w:cstheme="majorBidi" w:eastAsiaTheme="majorEastAsia" w:hAnsiTheme="majorHAnsi"/>
       <w:b/>
       <w:bCs/>
       <w:color w:themeColor="accent1" w:themeShade="bf" w:val="365F91"/>
@@ -4522,7 +4495,7 @@
       <w:outlineLvl w:val="1"/>
     </w:pPr>
     <w:rPr>
-      <w:rFonts w:ascii="Calibri" w:hAnsi="Calibri" w:eastAsia="ＭＳ ゴシック" w:cs="" w:asciiTheme="majorHAnsi" w:cstheme="majorBidi" w:eastAsiaTheme="majorEastAsia" w:hAnsiTheme="majorHAnsi"/>
+      <w:rFonts w:ascii="Calibri" w:hAnsi="Calibri" w:eastAsia="" w:cs="" w:asciiTheme="majorHAnsi" w:cstheme="majorBidi" w:eastAsiaTheme="majorEastAsia" w:hAnsiTheme="majorHAnsi"/>
       <w:b/>
       <w:bCs/>
       <w:color w:themeColor="accent1" w:val="4F81BD"/>
@@ -4546,7 +4519,7 @@
       <w:outlineLvl w:val="2"/>
     </w:pPr>
     <w:rPr>
-      <w:rFonts w:ascii="Calibri" w:hAnsi="Calibri" w:eastAsia="ＭＳ ゴシック" w:cs="" w:asciiTheme="majorHAnsi" w:cstheme="majorBidi" w:eastAsiaTheme="majorEastAsia" w:hAnsiTheme="majorHAnsi"/>
+      <w:rFonts w:ascii="Calibri" w:hAnsi="Calibri" w:eastAsia="" w:cs="" w:asciiTheme="majorHAnsi" w:cstheme="majorBidi" w:eastAsiaTheme="majorEastAsia" w:hAnsiTheme="majorHAnsi"/>
       <w:b/>
       <w:bCs/>
       <w:color w:themeColor="accent1" w:val="4F81BD"/>
@@ -4569,7 +4542,7 @@
       <w:outlineLvl w:val="3"/>
     </w:pPr>
     <w:rPr>
-      <w:rFonts w:ascii="Calibri" w:hAnsi="Calibri" w:eastAsia="ＭＳ ゴシック" w:cs="" w:asciiTheme="majorHAnsi" w:cstheme="majorBidi" w:eastAsiaTheme="majorEastAsia" w:hAnsiTheme="majorHAnsi"/>
+      <w:rFonts w:ascii="Calibri" w:hAnsi="Calibri" w:eastAsia="" w:cs="" w:asciiTheme="majorHAnsi" w:cstheme="majorBidi" w:eastAsiaTheme="majorEastAsia" w:hAnsiTheme="majorHAnsi"/>
       <w:b/>
       <w:bCs/>
       <w:i/>
@@ -4594,7 +4567,7 @@
       <w:outlineLvl w:val="4"/>
     </w:pPr>
     <w:rPr>
-      <w:rFonts w:ascii="Calibri" w:hAnsi="Calibri" w:eastAsia="ＭＳ ゴシック" w:cs="" w:asciiTheme="majorHAnsi" w:cstheme="majorBidi" w:eastAsiaTheme="majorEastAsia" w:hAnsiTheme="majorHAnsi"/>
+      <w:rFonts w:ascii="Calibri" w:hAnsi="Calibri" w:eastAsia="" w:cs="" w:asciiTheme="majorHAnsi" w:cstheme="majorBidi" w:eastAsiaTheme="majorEastAsia" w:hAnsiTheme="majorHAnsi"/>
       <w:color w:themeColor="accent1" w:themeShade="7f" w:val="243F60"/>
     </w:rPr>
   </w:style>
@@ -4615,7 +4588,7 @@
       <w:outlineLvl w:val="5"/>
     </w:pPr>
     <w:rPr>
-      <w:rFonts w:ascii="Calibri" w:hAnsi="Calibri" w:eastAsia="ＭＳ ゴシック" w:cs="" w:asciiTheme="majorHAnsi" w:cstheme="majorBidi" w:eastAsiaTheme="majorEastAsia" w:hAnsiTheme="majorHAnsi"/>
+      <w:rFonts w:ascii="Calibri" w:hAnsi="Calibri" w:eastAsia="" w:cs="" w:asciiTheme="majorHAnsi" w:cstheme="majorBidi" w:eastAsiaTheme="majorEastAsia" w:hAnsiTheme="majorHAnsi"/>
       <w:i/>
       <w:iCs/>
       <w:color w:themeColor="accent1" w:themeShade="7f" w:val="243F60"/>
@@ -4638,7 +4611,7 @@
       <w:outlineLvl w:val="6"/>
     </w:pPr>
     <w:rPr>
-      <w:rFonts w:ascii="Calibri" w:hAnsi="Calibri" w:eastAsia="ＭＳ ゴシック" w:cs="" w:asciiTheme="majorHAnsi" w:cstheme="majorBidi" w:eastAsiaTheme="majorEastAsia" w:hAnsiTheme="majorHAnsi"/>
+      <w:rFonts w:ascii="Calibri" w:hAnsi="Calibri" w:eastAsia="" w:cs="" w:asciiTheme="majorHAnsi" w:cstheme="majorBidi" w:eastAsiaTheme="majorEastAsia" w:hAnsiTheme="majorHAnsi"/>
       <w:i/>
       <w:iCs/>
       <w:color w:themeColor="text1" w:themeTint="bf" w:val="404040"/>
@@ -4661,7 +4634,7 @@
       <w:outlineLvl w:val="7"/>
     </w:pPr>
     <w:rPr>
-      <w:rFonts w:ascii="Calibri" w:hAnsi="Calibri" w:eastAsia="ＭＳ ゴシック" w:cs="" w:asciiTheme="majorHAnsi" w:cstheme="majorBidi" w:eastAsiaTheme="majorEastAsia" w:hAnsiTheme="majorHAnsi"/>
+      <w:rFonts w:ascii="Calibri" w:hAnsi="Calibri" w:eastAsia="" w:cs="" w:asciiTheme="majorHAnsi" w:cstheme="majorBidi" w:eastAsiaTheme="majorEastAsia" w:hAnsiTheme="majorHAnsi"/>
       <w:color w:themeColor="accent1" w:val="4F81BD"/>
       <w:sz w:val="20"/>
       <w:szCs w:val="20"/>
@@ -4684,7 +4657,7 @@
       <w:outlineLvl w:val="8"/>
     </w:pPr>
     <w:rPr>
-      <w:rFonts w:ascii="Calibri" w:hAnsi="Calibri" w:eastAsia="ＭＳ ゴシック" w:cs="" w:asciiTheme="majorHAnsi" w:cstheme="majorBidi" w:eastAsiaTheme="majorEastAsia" w:hAnsiTheme="majorHAnsi"/>
+      <w:rFonts w:ascii="Calibri" w:hAnsi="Calibri" w:eastAsia="" w:cs="" w:asciiTheme="majorHAnsi" w:cstheme="majorBidi" w:eastAsiaTheme="majorEastAsia" w:hAnsiTheme="majorHAnsi"/>
       <w:i/>
       <w:iCs/>
       <w:color w:themeColor="text1" w:themeTint="bf" w:val="404040"/>
@@ -4726,7 +4699,7 @@
     <w:qFormat/>
     <w:rsid w:val="00fc693f"/>
     <w:rPr>
-      <w:rFonts w:ascii="Calibri" w:hAnsi="Calibri" w:eastAsia="ＭＳ ゴシック" w:cs="" w:asciiTheme="majorHAnsi" w:cstheme="majorBidi" w:eastAsiaTheme="majorEastAsia" w:hAnsiTheme="majorHAnsi"/>
+      <w:rFonts w:ascii="Calibri" w:hAnsi="Calibri" w:eastAsia="" w:cs="" w:asciiTheme="majorHAnsi" w:cstheme="majorBidi" w:eastAsiaTheme="majorEastAsia" w:hAnsiTheme="majorHAnsi"/>
       <w:b/>
       <w:bCs/>
       <w:color w:themeColor="accent1" w:themeShade="bf" w:val="365F91"/>
@@ -4742,7 +4715,7 @@
     <w:qFormat/>
     <w:rsid w:val="00fc693f"/>
     <w:rPr>
-      <w:rFonts w:ascii="Calibri" w:hAnsi="Calibri" w:eastAsia="ＭＳ ゴシック" w:cs="" w:asciiTheme="majorHAnsi" w:cstheme="majorBidi" w:eastAsiaTheme="majorEastAsia" w:hAnsiTheme="majorHAnsi"/>
+      <w:rFonts w:ascii="Calibri" w:hAnsi="Calibri" w:eastAsia="" w:cs="" w:asciiTheme="majorHAnsi" w:cstheme="majorBidi" w:eastAsiaTheme="majorEastAsia" w:hAnsiTheme="majorHAnsi"/>
       <w:b/>
       <w:bCs/>
       <w:color w:themeColor="accent1" w:val="4F81BD"/>
@@ -4758,7 +4731,7 @@
     <w:qFormat/>
     <w:rsid w:val="00fc693f"/>
     <w:rPr>
-      <w:rFonts w:ascii="Calibri" w:hAnsi="Calibri" w:eastAsia="ＭＳ ゴシック" w:cs="" w:asciiTheme="majorHAnsi" w:cstheme="majorBidi" w:eastAsiaTheme="majorEastAsia" w:hAnsiTheme="majorHAnsi"/>
+      <w:rFonts w:ascii="Calibri" w:hAnsi="Calibri" w:eastAsia="" w:cs="" w:asciiTheme="majorHAnsi" w:cstheme="majorBidi" w:eastAsiaTheme="majorEastAsia" w:hAnsiTheme="majorHAnsi"/>
       <w:b/>
       <w:bCs/>
       <w:color w:themeColor="accent1" w:val="4F81BD"/>
@@ -4772,7 +4745,7 @@
     <w:qFormat/>
     <w:rsid w:val="00fc693f"/>
     <w:rPr>
-      <w:rFonts w:ascii="Calibri" w:hAnsi="Calibri" w:eastAsia="ＭＳ ゴシック" w:cs="" w:asciiTheme="majorHAnsi" w:cstheme="majorBidi" w:eastAsiaTheme="majorEastAsia" w:hAnsiTheme="majorHAnsi"/>
+      <w:rFonts w:ascii="Calibri" w:hAnsi="Calibri" w:eastAsia="" w:cs="" w:asciiTheme="majorHAnsi" w:cstheme="majorBidi" w:eastAsiaTheme="majorEastAsia" w:hAnsiTheme="majorHAnsi"/>
       <w:color w:themeColor="text2" w:themeShade="bf" w:val="17365D"/>
       <w:spacing w:val="5"/>
       <w:kern w:val="2"/>
@@ -4788,7 +4761,7 @@
     <w:qFormat/>
     <w:rsid w:val="00fc693f"/>
     <w:rPr>
-      <w:rFonts w:ascii="Calibri" w:hAnsi="Calibri" w:eastAsia="ＭＳ ゴシック" w:cs="" w:asciiTheme="majorHAnsi" w:cstheme="majorBidi" w:eastAsiaTheme="majorEastAsia" w:hAnsiTheme="majorHAnsi"/>
+      <w:rFonts w:ascii="Calibri" w:hAnsi="Calibri" w:eastAsia="" w:cs="" w:asciiTheme="majorHAnsi" w:cstheme="majorBidi" w:eastAsiaTheme="majorEastAsia" w:hAnsiTheme="majorHAnsi"/>
       <w:i/>
       <w:iCs/>
       <w:color w:themeColor="accent1" w:val="4F81BD"/>
@@ -4861,7 +4834,7 @@
     <w:qFormat/>
     <w:rsid w:val="00fc693f"/>
     <w:rPr>
-      <w:rFonts w:ascii="Calibri" w:hAnsi="Calibri" w:eastAsia="ＭＳ ゴシック" w:cs="" w:asciiTheme="majorHAnsi" w:cstheme="majorBidi" w:eastAsiaTheme="majorEastAsia" w:hAnsiTheme="majorHAnsi"/>
+      <w:rFonts w:ascii="Calibri" w:hAnsi="Calibri" w:eastAsia="" w:cs="" w:asciiTheme="majorHAnsi" w:cstheme="majorBidi" w:eastAsiaTheme="majorEastAsia" w:hAnsiTheme="majorHAnsi"/>
       <w:b/>
       <w:bCs/>
       <w:i/>
@@ -4878,7 +4851,7 @@
     <w:qFormat/>
     <w:rsid w:val="00fc693f"/>
     <w:rPr>
-      <w:rFonts w:ascii="Calibri" w:hAnsi="Calibri" w:eastAsia="ＭＳ ゴシック" w:cs="" w:asciiTheme="majorHAnsi" w:cstheme="majorBidi" w:eastAsiaTheme="majorEastAsia" w:hAnsiTheme="majorHAnsi"/>
+      <w:rFonts w:ascii="Calibri" w:hAnsi="Calibri" w:eastAsia="" w:cs="" w:asciiTheme="majorHAnsi" w:cstheme="majorBidi" w:eastAsiaTheme="majorEastAsia" w:hAnsiTheme="majorHAnsi"/>
       <w:color w:themeColor="accent1" w:themeShade="7f" w:val="243F60"/>
     </w:rPr>
   </w:style>
@@ -4891,7 +4864,7 @@
     <w:qFormat/>
     <w:rsid w:val="00fc693f"/>
     <w:rPr>
-      <w:rFonts w:ascii="Calibri" w:hAnsi="Calibri" w:eastAsia="ＭＳ ゴシック" w:cs="" w:asciiTheme="majorHAnsi" w:cstheme="majorBidi" w:eastAsiaTheme="majorEastAsia" w:hAnsiTheme="majorHAnsi"/>
+      <w:rFonts w:ascii="Calibri" w:hAnsi="Calibri" w:eastAsia="" w:cs="" w:asciiTheme="majorHAnsi" w:cstheme="majorBidi" w:eastAsiaTheme="majorEastAsia" w:hAnsiTheme="majorHAnsi"/>
       <w:i/>
       <w:iCs/>
       <w:color w:themeColor="accent1" w:themeShade="7f" w:val="243F60"/>
@@ -4906,7 +4879,7 @@
     <w:qFormat/>
     <w:rsid w:val="00fc693f"/>
     <w:rPr>
-      <w:rFonts w:ascii="Calibri" w:hAnsi="Calibri" w:eastAsia="ＭＳ ゴシック" w:cs="" w:asciiTheme="majorHAnsi" w:cstheme="majorBidi" w:eastAsiaTheme="majorEastAsia" w:hAnsiTheme="majorHAnsi"/>
+      <w:rFonts w:ascii="Calibri" w:hAnsi="Calibri" w:eastAsia="" w:cs="" w:asciiTheme="majorHAnsi" w:cstheme="majorBidi" w:eastAsiaTheme="majorEastAsia" w:hAnsiTheme="majorHAnsi"/>
       <w:i/>
       <w:iCs/>
       <w:color w:themeColor="text1" w:themeTint="bf" w:val="404040"/>
@@ -4921,7 +4894,7 @@
     <w:qFormat/>
     <w:rsid w:val="00fc693f"/>
     <w:rPr>
-      <w:rFonts w:ascii="Calibri" w:hAnsi="Calibri" w:eastAsia="ＭＳ ゴシック" w:cs="" w:asciiTheme="majorHAnsi" w:cstheme="majorBidi" w:eastAsiaTheme="majorEastAsia" w:hAnsiTheme="majorHAnsi"/>
+      <w:rFonts w:ascii="Calibri" w:hAnsi="Calibri" w:eastAsia="" w:cs="" w:asciiTheme="majorHAnsi" w:cstheme="majorBidi" w:eastAsiaTheme="majorEastAsia" w:hAnsiTheme="majorHAnsi"/>
       <w:color w:themeColor="accent1" w:val="4F81BD"/>
       <w:sz w:val="20"/>
       <w:szCs w:val="20"/>
@@ -4936,7 +4909,7 @@
     <w:qFormat/>
     <w:rsid w:val="00fc693f"/>
     <w:rPr>
-      <w:rFonts w:ascii="Calibri" w:hAnsi="Calibri" w:eastAsia="ＭＳ ゴシック" w:cs="" w:asciiTheme="majorHAnsi" w:cstheme="majorBidi" w:eastAsiaTheme="majorEastAsia" w:hAnsiTheme="majorHAnsi"/>
+      <w:rFonts w:ascii="Calibri" w:hAnsi="Calibri" w:eastAsia="" w:cs="" w:asciiTheme="majorHAnsi" w:cstheme="majorBidi" w:eastAsiaTheme="majorEastAsia" w:hAnsiTheme="majorHAnsi"/>
       <w:i/>
       <w:iCs/>
       <w:color w:themeColor="text1" w:themeTint="bf" w:val="404040"/>
@@ -5166,12 +5139,13 @@
     <w:rsid w:val="00fc693f"/>
     <w:pPr>
       <w:widowControl/>
+      <w:suppressAutoHyphens w:val="true"/>
       <w:bidi w:val="0"/>
       <w:spacing w:lineRule="auto" w:line="240" w:before="0" w:after="0"/>
       <w:jc w:val="left"/>
     </w:pPr>
     <w:rPr>
-      <w:rFonts w:ascii="Cambria" w:hAnsi="Cambria" w:eastAsia="ＭＳ 明朝" w:cs="" w:asciiTheme="minorHAnsi" w:cstheme="minorBidi" w:eastAsiaTheme="minorEastAsia" w:hAnsiTheme="minorHAnsi"/>
+      <w:rFonts w:ascii="Cambria" w:hAnsi="Cambria" w:eastAsia="" w:cs="" w:asciiTheme="minorHAnsi" w:cstheme="minorBidi" w:eastAsiaTheme="minorEastAsia" w:hAnsiTheme="minorHAnsi"/>
       <w:color w:val="auto"/>
       <w:kern w:val="0"/>
       <w:sz w:val="22"/>
@@ -5195,7 +5169,7 @@
       <w:contextualSpacing/>
     </w:pPr>
     <w:rPr>
-      <w:rFonts w:ascii="Calibri" w:hAnsi="Calibri" w:eastAsia="ＭＳ ゴシック" w:cs="" w:asciiTheme="majorHAnsi" w:cstheme="majorBidi" w:eastAsiaTheme="majorEastAsia" w:hAnsiTheme="majorHAnsi"/>
+      <w:rFonts w:ascii="Calibri" w:hAnsi="Calibri" w:eastAsia="" w:cs="" w:asciiTheme="majorHAnsi" w:cstheme="majorBidi" w:eastAsiaTheme="majorEastAsia" w:hAnsiTheme="majorHAnsi"/>
       <w:color w:themeColor="text2" w:themeShade="bf" w:val="17365D"/>
       <w:spacing w:val="5"/>
       <w:kern w:val="2"/>
@@ -5213,7 +5187,7 @@
     <w:rsid w:val="00fc693f"/>
     <w:pPr/>
     <w:rPr>
-      <w:rFonts w:ascii="Calibri" w:hAnsi="Calibri" w:eastAsia="ＭＳ ゴシック" w:cs="" w:asciiTheme="majorHAnsi" w:cstheme="majorBidi" w:eastAsiaTheme="majorEastAsia" w:hAnsiTheme="majorHAnsi"/>
+      <w:rFonts w:ascii="Calibri" w:hAnsi="Calibri" w:eastAsia="" w:cs="" w:asciiTheme="majorHAnsi" w:cstheme="majorBidi" w:eastAsiaTheme="majorEastAsia" w:hAnsiTheme="majorHAnsi"/>
       <w:i/>
       <w:iCs/>
       <w:color w:themeColor="accent1" w:val="4F81BD"/>
@@ -5446,12 +5420,13 @@
         <w:tab w:val="left" w:pos="3456" w:leader="none"/>
         <w:tab w:val="left" w:pos="4032" w:leader="none"/>
       </w:tabs>
+      <w:suppressAutoHyphens w:val="true"/>
       <w:bidi w:val="0"/>
       <w:spacing w:lineRule="auto" w:line="276" w:before="0" w:after="200"/>
       <w:jc w:val="left"/>
     </w:pPr>
     <w:rPr>
-      <w:rFonts w:ascii="Courier" w:hAnsi="Courier" w:eastAsia="ＭＳ 明朝" w:cs="" w:cstheme="minorBidi" w:eastAsiaTheme="minorEastAsia"/>
+      <w:rFonts w:ascii="Courier" w:hAnsi="Courier" w:eastAsia="" w:cs="" w:cstheme="minorBidi" w:eastAsiaTheme="minorEastAsia"/>
       <w:color w:val="auto"/>
       <w:kern w:val="0"/>
       <w:sz w:val="20"/>
@@ -8649,7 +8624,6 @@
       <w:pPr>
         <w:spacing w:before="0" w:after="0" w:line="240" w:lineRule="auto"/>
       </w:pPr>
-      <w:rPr/>
       <w:tblPr/>
       <w:tcPr>
         <w:tcBorders>
@@ -8795,7 +8769,6 @@
       <w:pPr>
         <w:spacing w:before="0" w:after="0" w:line="240" w:lineRule="auto"/>
       </w:pPr>
-      <w:rPr/>
       <w:tblPr/>
       <w:tcPr>
         <w:tcBorders>
@@ -8941,7 +8914,6 @@
       <w:pPr>
         <w:spacing w:before="0" w:after="0" w:line="240" w:lineRule="auto"/>
       </w:pPr>
-      <w:rPr/>
       <w:tblPr/>
       <w:tcPr>
         <w:tcBorders>
@@ -9087,7 +9059,6 @@
       <w:pPr>
         <w:spacing w:before="0" w:after="0" w:line="240" w:lineRule="auto"/>
       </w:pPr>
-      <w:rPr/>
       <w:tblPr/>
       <w:tcPr>
         <w:tcBorders>
@@ -9233,7 +9204,6 @@
       <w:pPr>
         <w:spacing w:before="0" w:after="0" w:line="240" w:lineRule="auto"/>
       </w:pPr>
-      <w:rPr/>
       <w:tblPr/>
       <w:tcPr>
         <w:tcBorders>
@@ -9379,7 +9349,6 @@
       <w:pPr>
         <w:spacing w:before="0" w:after="0" w:line="240" w:lineRule="auto"/>
       </w:pPr>
-      <w:rPr/>
       <w:tblPr/>
       <w:tcPr>
         <w:tcBorders>
@@ -9525,7 +9494,6 @@
       <w:pPr>
         <w:spacing w:before="0" w:after="0" w:line="240" w:lineRule="auto"/>
       </w:pPr>
-      <w:rPr/>
       <w:tblPr/>
       <w:tcPr>
         <w:tcBorders>

</xml_diff>